<commit_message>
Rapport: intègre la confrontation à la littérature (section 8), niveaux de confiance et conclusions révisées
- Nouvelle section 8: confrontation litterature, tableau de revision des
  conclusions, refutation 'C-band impossible' (Hrysiewicz et al. 2024 RSE),
  nuance double-bounce/VV, non-detection vs preuve d'absence, 6 experiences
  decisives, biais identifies; etiquetage [FAIT]/[HYP]/[INT]/[SPEC]
- Resume executif et section 7 corriges (site vs methode non separes)
- Annexe D: references cles; sections 9-15 renumerotees
</commit_message>
<xml_diff>
--- a/reports/Rapport_General_Rzecin.docx
+++ b/reports/Rapport_General_Rzecin.docx
@@ -134,7 +134,7 @@
     <w:p>
       <w:pPr>
         <w:pBdr>
-          <w:left w:val="single" w:color="B00020" w:sz="18" w:space="10"/>
+          <w:left w:val="single" w:color="9A6700" w:sz="18" w:space="10"/>
         </w:pBdr>
         <w:spacing w:after="200" w:before="120"/>
       </w:pPr>
@@ -143,30 +143,20 @@
           <w:b/>
           <w:bCs/>
         </w:rPr>
-        <w:t xml:space="preserve">Conclusion centrale : </w:t>
-      </w:r>
-      <w:r>
-        <w:t xml:space="preserve">l'échec de l'InSAR Sentinel-1 (bande C) à produire un champ de déplacement vertical exploitable à Rzecin n'est </w:t>
-      </w:r>
-      <w:r>
-        <w:rPr>
-          <w:i/>
-          <w:iCs/>
-        </w:rPr>
-        <w:t xml:space="preserve">pas</w:t>
-      </w:r>
-      <w:r>
-        <w:t xml:space="preserve"> un défaut d'implémentation logicielle. C'est une </w:t>
+        <w:t xml:space="preserve">Conclusion centrale (révisée après confrontation à la littérature, §8) : </w:t>
+      </w:r>
+      <w:r>
+        <w:t xml:space="preserve">nous n'avons pas extrait de champ de déplacement vertical net fiable à Rzecin avec Sentinel-1 (bande C, VV, cycle 12 j, réseau ≤48 j, MintPy). </w:t>
       </w:r>
       <w:r>
         <w:rPr>
           <w:b/>
           <w:bCs/>
         </w:rPr>
-        <w:t xml:space="preserve">impossibilité d'observabilité physique</w:t>
-      </w:r>
-      <w:r>
-        <w:t xml:space="preserve"> : sur un fen transitionnel flottant à nappe affleurante/émergente, la phase radar en bande C ne mesure pas le mouvement du sol tourbeux. Le déplacement vertical réel doit venir des capteurs géodésiques (drone, laser) ; Sentinel-1/2 doivent être reformulés en capteurs de </w:t>
+        <w:t xml:space="preserve">Nous ne pouvons PAS attribuer cet échec à une impossibilité physique de la bande C</w:t>
+      </w:r>
+      <w:r>
+        <w:t xml:space="preserve"> : des équipes mesurent la respiration de tourbières en C-band avec une précision de quelques mm (Hrysiewicz et al. 2024, RSE). Deux causes restent NON séparées — le régime hydrologique inondé du fen, et nos choix de méthode (réseau court uniquement, VV, petite AOI). La stratégie robuste demeure : le vertical net vient des capteurs géodésiques (drone, laser) ; Sentinel-1/2 comme </w:t>
       </w:r>
       <w:r>
         <w:rPr>
@@ -176,7 +166,7 @@
         <w:t xml:space="preserve">covariable hydrologique</w:t>
       </w:r>
       <w:r>
-        <w:t xml:space="preserve">, non de déformation.</w:t>
+        <w:t xml:space="preserve"> — conclusion, elle, fortement étayée.</w:t>
       </w:r>
     </w:p>
     <w:p>
@@ -501,7 +491,7 @@
                 <w:sz w:val="18"/>
                 <w:szCs w:val="18"/>
               </w:rPr>
-              <w:t xml:space="preserve">Résultat nul robuste</w:t>
+              <w:t xml:space="preserve">Non-détection (SNR)</w:t>
             </w:r>
           </w:p>
         </w:tc>
@@ -530,7 +520,7 @@
                 <w:sz w:val="18"/>
                 <w:szCs w:val="18"/>
               </w:rPr>
-              <w:t xml:space="preserve">→ Interprétation physique</w:t>
+              <w:t xml:space="preserve">→ Statut du résultat</w:t>
             </w:r>
           </w:p>
         </w:tc>
@@ -554,7 +544,7 @@
                 <w:sz w:val="18"/>
                 <w:szCs w:val="18"/>
               </w:rPr>
-              <w:t xml:space="preserve">Non distinguable de zéro ; cohérent avec un fen préservé flottant</w:t>
+              <w:t xml:space="preserve">Indistinguable de 0 ET de −14 mm/an ; à confirmer (§8.5)</w:t>
             </w:r>
           </w:p>
         </w:tc>
@@ -578,7 +568,7 @@
                 <w:sz w:val="18"/>
                 <w:szCs w:val="18"/>
               </w:rPr>
-              <w:t xml:space="preserve">Acquis scientifique</w:t>
+              <w:t xml:space="preserve">À valider</w:t>
             </w:r>
           </w:p>
         </w:tc>
@@ -593,7 +583,7 @@
           <w:sz w:val="20"/>
           <w:szCs w:val="20"/>
         </w:rPr>
-        <w:t xml:space="preserve">Le résultat « nul » du Pipeline B (taux net indiscernable de zéro) est cohérent et attendu pour une tourbière quasi naturelle gorgée d'eau, dont le mouvement de surface est dominé par la respiration hydrologique réversible (flottaison du tapis) et non par une subsidence irréversible. Ce constat, loin d'être un échec, constitue un résultat publiable et le point de départ de la nouvelle stratégie.</w:t>
+        <w:t xml:space="preserve">Le taux net du Pipeline B (−4.5 ± 18.9 mm/an) est une NON-DÉTECTION : l'incertitude écrase le signal, on ne peut le distinguer ni de zéro ni de la valeur de Biebrza (−14 mm/an). L'hypothèse d'un fen préservé à respiration hydrologique réversible dominante reste l'interprétation la plus plausible, mais elle n'est pas démontrée par l'InSAR seul et devra être confirmée par le laser et le drone (§8.6).</w:t>
       </w:r>
     </w:p>
     <w:p>
@@ -4005,11 +3995,1162 @@
     </w:p>
     <w:p>
       <w:pPr>
+        <w:pBdr>
+          <w:left w:val="single" w:color="9A6700" w:sz="18" w:space="10"/>
+        </w:pBdr>
+        <w:spacing w:after="200" w:before="120"/>
+      </w:pPr>
+      <w:r>
+        <w:rPr>
+          <w:b/>
+          <w:bCs/>
+        </w:rPr>
+        <w:t xml:space="preserve">Avertissement de rigueur : </w:t>
+      </w:r>
+      <w:r>
+        <w:t xml:space="preserve">l'argument d'observabilité ci-dessus vaut spécifiquement pour les pixels INONDÉS (nappe au-dessus de la végétation). Il ne s'étend PAS à l'ensemble de la tourbière ni ne prouve que la bande C soit inutilisable ici — la littérature (§8) montre l'inverse sur tourbières non inondées. Statut : [INT] interprétation étayée sur les zones inondées, [HYP] non démontrée à l'échelle du site.</w:t>
+      </w:r>
+    </w:p>
+    <w:p>
+      <w:r>
+        <w:br w:type="page"/>
+      </w:r>
+    </w:p>
+    <w:p>
+      <w:pPr>
         <w:pStyle w:val="Heading1"/>
         <w:spacing w:after="200" w:before="400"/>
       </w:pPr>
       <w:r>
-        <w:t xml:space="preserve">8. Réorientation stratégique : une architecture qui respecte la physique</w:t>
+        <w:t xml:space="preserve">8. Confrontation à la littérature internationale et niveaux de confiance</w:t>
+      </w:r>
+    </w:p>
+    <w:p>
+      <w:pPr>
+        <w:spacing w:after="120"/>
+      </w:pPr>
+      <w:r>
+        <w:t xml:space="preserve">Cette section soumet nos propres conclusions à réfutation. Convention d'étiquetage : [FAIT] observé/mesuré · [HYP] hypothèse · [INT] interprétation · [SPEC] spéculation. Une revue ciblant délibérément les travaux qui CONTREDISENT notre approche (et pas seulement ceux qui la confirment) impose de réviser plusieurs affirmations.</w:t>
+      </w:r>
+    </w:p>
+    <w:p>
+      <w:pPr>
+        <w:pStyle w:val="Heading2"/>
+        <w:spacing w:after="150" w:before="300"/>
+      </w:pPr>
+      <w:r>
+        <w:t xml:space="preserve">8.1 Tableau de révision des conclusions</w:t>
+      </w:r>
+    </w:p>
+    <w:tbl>
+      <w:tblPr>
+        <w:tblW w:type="dxa" w:w="9200"/>
+        <w:tblBorders>
+          <w:top w:val="single" w:color="auto" w:sz="4"/>
+          <w:left w:val="single" w:color="auto" w:sz="4"/>
+          <w:bottom w:val="single" w:color="auto" w:sz="4"/>
+          <w:right w:val="single" w:color="auto" w:sz="4"/>
+          <w:insideH w:val="single" w:color="auto" w:sz="4"/>
+          <w:insideV w:val="single" w:color="auto" w:sz="4"/>
+        </w:tblBorders>
+      </w:tblPr>
+      <w:tblGrid>
+        <w:gridCol w:w="3864"/>
+        <w:gridCol w:w="3128"/>
+        <w:gridCol w:w="2208"/>
+      </w:tblGrid>
+      <w:tr>
+        <w:trPr>
+          <w:tblHeader/>
+        </w:trPr>
+        <w:tc>
+          <w:tcPr>
+            <w:tcW w:type="dxa" w:w="3864"/>
+            <w:shd w:fill="B00020" w:val="clear"/>
+            <w:tcMar>
+              <w:top w:type="dxa" w:w="50"/>
+              <w:left w:type="dxa" w:w="90"/>
+              <w:bottom w:type="dxa" w:w="50"/>
+              <w:right w:type="dxa" w:w="90"/>
+            </w:tcMar>
+          </w:tcPr>
+          <w:p>
+            <w:r>
+              <w:rPr>
+                <w:b/>
+                <w:bCs/>
+                <w:color w:val="FFFFFF"/>
+                <w:sz w:val="18"/>
+                <w:szCs w:val="18"/>
+              </w:rPr>
+              <w:t xml:space="preserve">Conclusion de notre rapport</w:t>
+            </w:r>
+          </w:p>
+        </w:tc>
+        <w:tc>
+          <w:tcPr>
+            <w:tcW w:type="dxa" w:w="3128"/>
+            <w:shd w:fill="B00020" w:val="clear"/>
+            <w:tcMar>
+              <w:top w:type="dxa" w:w="50"/>
+              <w:left w:type="dxa" w:w="90"/>
+              <w:bottom w:type="dxa" w:w="50"/>
+              <w:right w:type="dxa" w:w="90"/>
+            </w:tcMar>
+          </w:tcPr>
+          <w:p>
+            <w:r>
+              <w:rPr>
+                <w:b/>
+                <w:bCs/>
+                <w:color w:val="FFFFFF"/>
+                <w:sz w:val="18"/>
+                <w:szCs w:val="18"/>
+              </w:rPr>
+              <w:t xml:space="preserve">Verdict après revue</w:t>
+            </w:r>
+          </w:p>
+        </w:tc>
+        <w:tc>
+          <w:tcPr>
+            <w:tcW w:type="dxa" w:w="2208"/>
+            <w:shd w:fill="B00020" w:val="clear"/>
+            <w:tcMar>
+              <w:top w:type="dxa" w:w="50"/>
+              <w:left w:type="dxa" w:w="90"/>
+              <w:bottom w:type="dxa" w:w="50"/>
+              <w:right w:type="dxa" w:w="90"/>
+            </w:tcMar>
+          </w:tcPr>
+          <w:p>
+            <w:r>
+              <w:rPr>
+                <w:b/>
+                <w:bCs/>
+                <w:color w:val="FFFFFF"/>
+                <w:sz w:val="18"/>
+                <w:szCs w:val="18"/>
+              </w:rPr>
+              <w:t xml:space="preserve">Confiance révisée</w:t>
+            </w:r>
+          </w:p>
+        </w:tc>
+      </w:tr>
+      <w:tr>
+        <w:trPr>
+          <w:tblHeader w:val="false"/>
+        </w:trPr>
+        <w:tc>
+          <w:tcPr>
+            <w:tcW w:type="dxa" w:w="3864"/>
+            <w:tcMar>
+              <w:top w:type="dxa" w:w="50"/>
+              <w:left w:type="dxa" w:w="90"/>
+              <w:bottom w:type="dxa" w:w="50"/>
+              <w:right w:type="dxa" w:w="90"/>
+            </w:tcMar>
+          </w:tcPr>
+          <w:p>
+            <w:r>
+              <w:rPr>
+                <w:b w:val="false"/>
+                <w:bCs w:val="false"/>
+                <w:color w:val="000000"/>
+                <w:sz w:val="18"/>
+                <w:szCs w:val="18"/>
+              </w:rPr>
+              <w:t xml:space="preserve">« L'InSAR C-band ne PEUT PAS mesurer le vertical sur tourbière »</w:t>
+            </w:r>
+          </w:p>
+        </w:tc>
+        <w:tc>
+          <w:tcPr>
+            <w:tcW w:type="dxa" w:w="3128"/>
+            <w:tcMar>
+              <w:top w:type="dxa" w:w="50"/>
+              <w:left w:type="dxa" w:w="90"/>
+              <w:bottom w:type="dxa" w:w="50"/>
+              <w:right w:type="dxa" w:w="90"/>
+            </w:tcMar>
+          </w:tcPr>
+          <w:p>
+            <w:r>
+              <w:rPr>
+                <w:b w:val="false"/>
+                <w:bCs w:val="false"/>
+                <w:color w:val="000000"/>
+                <w:sz w:val="18"/>
+                <w:szCs w:val="18"/>
+              </w:rPr>
+              <w:t xml:space="preserve">RÉFUTÉE comme énoncé général</w:t>
+            </w:r>
+          </w:p>
+        </w:tc>
+        <w:tc>
+          <w:tcPr>
+            <w:tcW w:type="dxa" w:w="2208"/>
+            <w:tcMar>
+              <w:top w:type="dxa" w:w="50"/>
+              <w:left w:type="dxa" w:w="90"/>
+              <w:bottom w:type="dxa" w:w="50"/>
+              <w:right w:type="dxa" w:w="90"/>
+            </w:tcMar>
+          </w:tcPr>
+          <w:p>
+            <w:r>
+              <w:rPr>
+                <w:b w:val="false"/>
+                <w:bCs w:val="false"/>
+                <w:color w:val="000000"/>
+                <w:sz w:val="18"/>
+                <w:szCs w:val="18"/>
+              </w:rPr>
+              <w:t xml:space="preserve">Faible → à retirer</w:t>
+            </w:r>
+          </w:p>
+        </w:tc>
+      </w:tr>
+      <w:tr>
+        <w:trPr>
+          <w:tblHeader w:val="false"/>
+        </w:trPr>
+        <w:tc>
+          <w:tcPr>
+            <w:tcW w:type="dxa" w:w="3864"/>
+            <w:shd w:fill="F0F0F0" w:val="clear"/>
+            <w:tcMar>
+              <w:top w:type="dxa" w:w="50"/>
+              <w:left w:type="dxa" w:w="90"/>
+              <w:bottom w:type="dxa" w:w="50"/>
+              <w:right w:type="dxa" w:w="90"/>
+            </w:tcMar>
+          </w:tcPr>
+          <w:p>
+            <w:r>
+              <w:rPr>
+                <w:b w:val="false"/>
+                <w:bCs w:val="false"/>
+                <w:color w:val="000000"/>
+                <w:sz w:val="18"/>
+                <w:szCs w:val="18"/>
+              </w:rPr>
+              <w:t xml:space="preserve">« Notre échec est d'origine physique (bande C) »</w:t>
+            </w:r>
+          </w:p>
+        </w:tc>
+        <w:tc>
+          <w:tcPr>
+            <w:tcW w:type="dxa" w:w="3128"/>
+            <w:shd w:fill="F0F0F0" w:val="clear"/>
+            <w:tcMar>
+              <w:top w:type="dxa" w:w="50"/>
+              <w:left w:type="dxa" w:w="90"/>
+              <w:bottom w:type="dxa" w:w="50"/>
+              <w:right w:type="dxa" w:w="90"/>
+            </w:tcMar>
+          </w:tcPr>
+          <w:p>
+            <w:r>
+              <w:rPr>
+                <w:b w:val="false"/>
+                <w:bCs w:val="false"/>
+                <w:color w:val="000000"/>
+                <w:sz w:val="18"/>
+                <w:szCs w:val="18"/>
+              </w:rPr>
+              <w:t xml:space="preserve">CONFONDUE avec nos choix de méthode</w:t>
+            </w:r>
+          </w:p>
+        </w:tc>
+        <w:tc>
+          <w:tcPr>
+            <w:tcW w:type="dxa" w:w="2208"/>
+            <w:shd w:fill="F0F0F0" w:val="clear"/>
+            <w:tcMar>
+              <w:top w:type="dxa" w:w="50"/>
+              <w:left w:type="dxa" w:w="90"/>
+              <w:bottom w:type="dxa" w:w="50"/>
+              <w:right w:type="dxa" w:w="90"/>
+            </w:tcMar>
+          </w:tcPr>
+          <w:p>
+            <w:r>
+              <w:rPr>
+                <w:b w:val="false"/>
+                <w:bCs w:val="false"/>
+                <w:color w:val="000000"/>
+                <w:sz w:val="18"/>
+                <w:szCs w:val="18"/>
+              </w:rPr>
+              <w:t xml:space="preserve">Faible-modérée</w:t>
+            </w:r>
+          </w:p>
+        </w:tc>
+      </w:tr>
+      <w:tr>
+        <w:trPr>
+          <w:tblHeader w:val="false"/>
+        </w:trPr>
+        <w:tc>
+          <w:tcPr>
+            <w:tcW w:type="dxa" w:w="3864"/>
+            <w:tcMar>
+              <w:top w:type="dxa" w:w="50"/>
+              <w:left w:type="dxa" w:w="90"/>
+              <w:bottom w:type="dxa" w:w="50"/>
+              <w:right w:type="dxa" w:w="90"/>
+            </w:tcMar>
+          </w:tcPr>
+          <w:p>
+            <w:r>
+              <w:rPr>
+                <w:b w:val="false"/>
+                <w:bCs w:val="false"/>
+                <w:color w:val="000000"/>
+                <w:sz w:val="18"/>
+                <w:szCs w:val="18"/>
+              </w:rPr>
+              <w:t xml:space="preserve">« Le centre de phase sur végétation inondée n'est pas le sol »</w:t>
+            </w:r>
+          </w:p>
+        </w:tc>
+        <w:tc>
+          <w:tcPr>
+            <w:tcW w:type="dxa" w:w="3128"/>
+            <w:tcMar>
+              <w:top w:type="dxa" w:w="50"/>
+              <w:left w:type="dxa" w:w="90"/>
+              <w:bottom w:type="dxa" w:w="50"/>
+              <w:right w:type="dxa" w:w="90"/>
+            </w:tcMar>
+          </w:tcPr>
+          <w:p>
+            <w:r>
+              <w:rPr>
+                <w:b w:val="false"/>
+                <w:bCs w:val="false"/>
+                <w:color w:val="000000"/>
+                <w:sz w:val="18"/>
+                <w:szCs w:val="18"/>
+              </w:rPr>
+              <w:t xml:space="preserve">SOUTENUE mais à nuancer (VV)</w:t>
+            </w:r>
+          </w:p>
+        </w:tc>
+        <w:tc>
+          <w:tcPr>
+            <w:tcW w:type="dxa" w:w="2208"/>
+            <w:tcMar>
+              <w:top w:type="dxa" w:w="50"/>
+              <w:left w:type="dxa" w:w="90"/>
+              <w:bottom w:type="dxa" w:w="50"/>
+              <w:right w:type="dxa" w:w="90"/>
+            </w:tcMar>
+          </w:tcPr>
+          <w:p>
+            <w:r>
+              <w:rPr>
+                <w:b w:val="false"/>
+                <w:bCs w:val="false"/>
+                <w:color w:val="000000"/>
+                <w:sz w:val="18"/>
+                <w:szCs w:val="18"/>
+              </w:rPr>
+              <w:t xml:space="preserve">Élevée</w:t>
+            </w:r>
+          </w:p>
+        </w:tc>
+      </w:tr>
+      <w:tr>
+        <w:trPr>
+          <w:tblHeader w:val="false"/>
+        </w:trPr>
+        <w:tc>
+          <w:tcPr>
+            <w:tcW w:type="dxa" w:w="3864"/>
+            <w:shd w:fill="F0F0F0" w:val="clear"/>
+            <w:tcMar>
+              <w:top w:type="dxa" w:w="50"/>
+              <w:left w:type="dxa" w:w="90"/>
+              <w:bottom w:type="dxa" w:w="50"/>
+              <w:right w:type="dxa" w:w="90"/>
+            </w:tcMar>
+          </w:tcPr>
+          <w:p>
+            <w:r>
+              <w:rPr>
+                <w:b w:val="false"/>
+                <w:bCs w:val="false"/>
+                <w:color w:val="000000"/>
+                <w:sz w:val="18"/>
+                <w:szCs w:val="18"/>
+              </w:rPr>
+              <w:t xml:space="preserve">« Le taux net à Rzecin est ≈ 0 »</w:t>
+            </w:r>
+          </w:p>
+        </w:tc>
+        <w:tc>
+          <w:tcPr>
+            <w:tcW w:type="dxa" w:w="3128"/>
+            <w:shd w:fill="F0F0F0" w:val="clear"/>
+            <w:tcMar>
+              <w:top w:type="dxa" w:w="50"/>
+              <w:left w:type="dxa" w:w="90"/>
+              <w:bottom w:type="dxa" w:w="50"/>
+              <w:right w:type="dxa" w:w="90"/>
+            </w:tcMar>
+          </w:tcPr>
+          <w:p>
+            <w:r>
+              <w:rPr>
+                <w:b w:val="false"/>
+                <w:bCs w:val="false"/>
+                <w:color w:val="000000"/>
+                <w:sz w:val="18"/>
+                <w:szCs w:val="18"/>
+              </w:rPr>
+              <w:t xml:space="preserve">Plausible, NON démontré (SNR)</w:t>
+            </w:r>
+          </w:p>
+        </w:tc>
+        <w:tc>
+          <w:tcPr>
+            <w:tcW w:type="dxa" w:w="2208"/>
+            <w:shd w:fill="F0F0F0" w:val="clear"/>
+            <w:tcMar>
+              <w:top w:type="dxa" w:w="50"/>
+              <w:left w:type="dxa" w:w="90"/>
+              <w:bottom w:type="dxa" w:w="50"/>
+              <w:right w:type="dxa" w:w="90"/>
+            </w:tcMar>
+          </w:tcPr>
+          <w:p>
+            <w:r>
+              <w:rPr>
+                <w:b w:val="false"/>
+                <w:bCs w:val="false"/>
+                <w:color w:val="000000"/>
+                <w:sz w:val="18"/>
+                <w:szCs w:val="18"/>
+              </w:rPr>
+              <w:t xml:space="preserve">Modérée</w:t>
+            </w:r>
+          </w:p>
+        </w:tc>
+      </w:tr>
+      <w:tr>
+        <w:trPr>
+          <w:tblHeader w:val="false"/>
+        </w:trPr>
+        <w:tc>
+          <w:tcPr>
+            <w:tcW w:type="dxa" w:w="3864"/>
+            <w:tcMar>
+              <w:top w:type="dxa" w:w="50"/>
+              <w:left w:type="dxa" w:w="90"/>
+              <w:bottom w:type="dxa" w:w="50"/>
+              <w:right w:type="dxa" w:w="90"/>
+            </w:tcMar>
+          </w:tcPr>
+          <w:p>
+            <w:r>
+              <w:rPr>
+                <w:b w:val="false"/>
+                <w:bCs w:val="false"/>
+                <w:color w:val="000000"/>
+                <w:sz w:val="18"/>
+                <w:szCs w:val="18"/>
+              </w:rPr>
+              <w:t xml:space="preserve">« S1/S2 = covariable hydrologique / nappe »</w:t>
+            </w:r>
+          </w:p>
+        </w:tc>
+        <w:tc>
+          <w:tcPr>
+            <w:tcW w:type="dxa" w:w="3128"/>
+            <w:tcMar>
+              <w:top w:type="dxa" w:w="50"/>
+              <w:left w:type="dxa" w:w="90"/>
+              <w:bottom w:type="dxa" w:w="50"/>
+              <w:right w:type="dxa" w:w="90"/>
+            </w:tcMar>
+          </w:tcPr>
+          <w:p>
+            <w:r>
+              <w:rPr>
+                <w:b w:val="false"/>
+                <w:bCs w:val="false"/>
+                <w:color w:val="000000"/>
+                <w:sz w:val="18"/>
+                <w:szCs w:val="18"/>
+              </w:rPr>
+              <w:t xml:space="preserve">FORTEMENT SOUTENUE</w:t>
+            </w:r>
+          </w:p>
+        </w:tc>
+        <w:tc>
+          <w:tcPr>
+            <w:tcW w:type="dxa" w:w="2208"/>
+            <w:tcMar>
+              <w:top w:type="dxa" w:w="50"/>
+              <w:left w:type="dxa" w:w="90"/>
+              <w:bottom w:type="dxa" w:w="50"/>
+              <w:right w:type="dxa" w:w="90"/>
+            </w:tcMar>
+          </w:tcPr>
+          <w:p>
+            <w:r>
+              <w:rPr>
+                <w:b w:val="false"/>
+                <w:bCs w:val="false"/>
+                <w:color w:val="000000"/>
+                <w:sz w:val="18"/>
+                <w:szCs w:val="18"/>
+              </w:rPr>
+              <w:t xml:space="preserve">Élevée</w:t>
+            </w:r>
+          </w:p>
+        </w:tc>
+      </w:tr>
+      <w:tr>
+        <w:trPr>
+          <w:tblHeader w:val="false"/>
+        </w:trPr>
+        <w:tc>
+          <w:tcPr>
+            <w:tcW w:type="dxa" w:w="3864"/>
+            <w:shd w:fill="F0F0F0" w:val="clear"/>
+            <w:tcMar>
+              <w:top w:type="dxa" w:w="50"/>
+              <w:left w:type="dxa" w:w="90"/>
+              <w:bottom w:type="dxa" w:w="50"/>
+              <w:right w:type="dxa" w:w="90"/>
+            </w:tcMar>
+          </w:tcPr>
+          <w:p>
+            <w:r>
+              <w:rPr>
+                <w:b w:val="false"/>
+                <w:bCs w:val="false"/>
+                <w:color w:val="000000"/>
+                <w:sz w:val="18"/>
+                <w:szCs w:val="18"/>
+              </w:rPr>
+              <w:t xml:space="preserve">« La bande L est la solution physique »</w:t>
+            </w:r>
+          </w:p>
+        </w:tc>
+        <w:tc>
+          <w:tcPr>
+            <w:tcW w:type="dxa" w:w="3128"/>
+            <w:shd w:fill="F0F0F0" w:val="clear"/>
+            <w:tcMar>
+              <w:top w:type="dxa" w:w="50"/>
+              <w:left w:type="dxa" w:w="90"/>
+              <w:bottom w:type="dxa" w:w="50"/>
+              <w:right w:type="dxa" w:w="90"/>
+            </w:tcMar>
+          </w:tcPr>
+          <w:p>
+            <w:r>
+              <w:rPr>
+                <w:b w:val="false"/>
+                <w:bCs w:val="false"/>
+                <w:color w:val="000000"/>
+                <w:sz w:val="18"/>
+                <w:szCs w:val="18"/>
+              </w:rPr>
+              <w:t xml:space="preserve">Soutenue, bénéfice à quantifier</w:t>
+            </w:r>
+          </w:p>
+        </w:tc>
+        <w:tc>
+          <w:tcPr>
+            <w:tcW w:type="dxa" w:w="2208"/>
+            <w:shd w:fill="F0F0F0" w:val="clear"/>
+            <w:tcMar>
+              <w:top w:type="dxa" w:w="50"/>
+              <w:left w:type="dxa" w:w="90"/>
+              <w:bottom w:type="dxa" w:w="50"/>
+              <w:right w:type="dxa" w:w="90"/>
+            </w:tcMar>
+          </w:tcPr>
+          <w:p>
+            <w:r>
+              <w:rPr>
+                <w:b w:val="false"/>
+                <w:bCs w:val="false"/>
+                <w:color w:val="000000"/>
+                <w:sz w:val="18"/>
+                <w:szCs w:val="18"/>
+              </w:rPr>
+              <w:t xml:space="preserve">Modérée-élevée</w:t>
+            </w:r>
+          </w:p>
+        </w:tc>
+      </w:tr>
+    </w:tbl>
+    <w:p>
+      <w:pPr>
+        <w:pStyle w:val="Heading2"/>
+        <w:spacing w:after="150" w:before="300"/>
+      </w:pPr>
+      <w:r>
+        <w:t xml:space="preserve">8.2 La contre-preuve majeure : l'InSAR C-band mesure la respiration des tourbières</w:t>
+      </w:r>
+    </w:p>
+    <w:p>
+      <w:pPr>
+        <w:spacing w:after="120"/>
+      </w:pPr>
+      <w:r>
+        <w:t xml:space="preserve">[FAIT] Hrysiewicz et al. (2024, Remote Sensing of Environment 291) appliquent l'InSAR Sentinel-1 C-band à deux tourbières hautes tempérées (Cors Fochno, Cors Caron, Pays de Galles), validé par caméras in situ sub-millimétriques : corrélation de Pearson 0.8–0.9 ; 76 % des écarts &lt; ±5 mm, 93 % &lt; ±10 mm ; RMSE multi-annuel ~7 mm/an (~3.5 mm en individuel). La méthode récupère les oscillations annuelles de surface de 10–40 mm — la « respiration » que nous avions qualifiée de bruit confondant.</w:t>
+      </w:r>
+    </w:p>
+    <w:p>
+      <w:pPr>
+        <w:spacing w:after="120"/>
+      </w:pPr>
+      <w:r>
+        <w:t xml:space="preserve">[FAIT] Des SBAS C-band réussissent aussi sur tourbières tropicales (seuil de cohérence 0.25, ~2/3 de couverture ; performance comparable à l'ALOS L-band). [INT] Conclusion : notre affirmation « C-band impossible » relève d'une sur-généralisation d'un échec sur un site/une configuration.</w:t>
+      </w:r>
+    </w:p>
+    <w:p>
+      <w:pPr>
+        <w:pBdr>
+          <w:left w:val="single" w:color="B00020" w:sz="18" w:space="10"/>
+        </w:pBdr>
+        <w:spacing w:after="200" w:before="120"/>
+      </w:pPr>
+      <w:r>
+        <w:rPr>
+          <w:b/>
+          <w:bCs/>
+        </w:rPr>
+        <w:t xml:space="preserve">Différence de méthode que nous avions ignorée (décisive) : </w:t>
+      </w:r>
+      <w:r>
+        <w:t xml:space="preserve">[FAIT] Hrysiewicz combine des réseaux à lignes de base temporelles LONGUES ET courtes. [FAIT] Notre configuration n'a utilisé que des paires ≤ 48 j (max_temporal_baseline_days: 48). Nous n'avons jamais testé le réseau long-baseline qui fait le succès des autres. [INT] Une partie de notre « limite physique » pourrait n'être qu'une limite de conception de réseau.</w:t>
+      </w:r>
+    </w:p>
+    <w:p>
+      <w:pPr>
+        <w:pStyle w:val="Heading2"/>
+        <w:spacing w:after="150" w:before="300"/>
+      </w:pPr>
+      <w:r>
+        <w:t xml:space="preserve">8.3 La différence de site : bog non inondé vs fen inondé (l'hypothèse à tester)</w:t>
+      </w:r>
+    </w:p>
+    <w:p>
+      <w:pPr>
+        <w:spacing w:after="120"/>
+      </w:pPr>
+      <w:r>
+        <w:t xml:space="preserve">[FAIT] Les sites où l'InSAR C-band réussit sont des bogs ombrotrophes (nappe SOUS la surface, tapis non inondé). Rzecin est un fen transitionnel minerotrophe à nappe affleurante/émergente. [HYP] Le régime hydrologique (inondé vs non), et non la bande, serait le vrai discriminant — hypothèse testable (§8.6), non démontrée à ce stade.</w:t>
+      </w:r>
+    </w:p>
+    <w:p>
+      <w:pPr>
+        <w:pStyle w:val="Heading2"/>
+        <w:spacing w:after="150" w:before="300"/>
+      </w:pPr>
+      <w:r>
+        <w:t xml:space="preserve">8.4 Le centre de phase : point solide, mais VV l'affaiblit</w:t>
+      </w:r>
+    </w:p>
+    <w:p>
+      <w:pPr>
+        <w:spacing w:after="120"/>
+      </w:pPr>
+      <w:r>
+        <w:t xml:space="preserve">[FAIT] Le champ mature du « wetland InSAR » (Wdowinski &amp; Hong ; Hong &amp; Wdowinski 2014, IEEE TGRS) établit que sur végétation émergente inondée, le double-bounce domine et l'InSAR mesure le niveau d'eau — confirmant que la phase n'est pas le sol. [FAIT] Mais « la végétation émergente augmente la cohérence en saison de croissance » contredit l'idée simple « inondation = décorrélation totale ». [FAIT] Surtout, le C-band en VV (notre polarisation) est MOINS sensible au double-bounce que le HH. [INT] À Rzecin en VV sur zones inondées : ni bon signal de niveau d'eau (VV faible en double-bounce), ni bon signal de sol (volume décorrélant) ; le HH aurait été préférable mais est indisponible sur cette trace (VV/VH). « Donc bruit pur » est trop fort : c'est un signal de niveau d'eau mal capté, pas du bruit.</w:t>
+      </w:r>
+    </w:p>
+    <w:p>
+      <w:pPr>
+        <w:pStyle w:val="Heading2"/>
+        <w:spacing w:after="150" w:before="300"/>
+      </w:pPr>
+      <w:r>
+        <w:t xml:space="preserve">8.5 Le taux net ≈ 0 : non-détection, pas preuve d'absence</w:t>
+      </w:r>
+    </w:p>
+    <w:p>
+      <w:pPr>
+        <w:spacing w:after="120"/>
+      </w:pPr>
+      <w:r>
+        <w:t xml:space="preserve">[FAIT] Pipeline B : AOI médiane −4.5 mm/an, IQR ±18.9 mm/an. [INT] L'incertitude écrasant le signal, on ne peut distinguer statistiquement −4.5 mm/an ni de 0 ni de −14 mm/an (Biebrza). « Taux net non détectable avec cette méthode » : confiance élevée. « Taux net physiquement ≈ 0 » : confiance modérée-faible (absence de preuve ≠ preuve d'absence). [HYP] Biais possible : le deramp planaire peut amputer un vrai signal à grande longueur d'onde. [SPEC] Un fen alimenté par la nappe pourrait gonfler (signe opposé à Biebrza).</w:t>
+      </w:r>
+    </w:p>
+    <w:p>
+      <w:pPr>
+        <w:pStyle w:val="Heading2"/>
+        <w:spacing w:after="150" w:before="300"/>
+      </w:pPr>
+      <w:r>
+        <w:t xml:space="preserve">8.6 Expériences décisives (avant toute affirmation forte)</w:t>
+      </w:r>
+    </w:p>
+    <w:tbl>
+      <w:tblPr>
+        <w:tblW w:type="dxa" w:w="9200"/>
+        <w:tblBorders>
+          <w:top w:val="single" w:color="auto" w:sz="4"/>
+          <w:left w:val="single" w:color="auto" w:sz="4"/>
+          <w:bottom w:val="single" w:color="auto" w:sz="4"/>
+          <w:right w:val="single" w:color="auto" w:sz="4"/>
+          <w:insideH w:val="single" w:color="auto" w:sz="4"/>
+          <w:insideV w:val="single" w:color="auto" w:sz="4"/>
+        </w:tblBorders>
+      </w:tblPr>
+      <w:tblGrid>
+        <w:gridCol w:w="5060"/>
+        <w:gridCol w:w="4140"/>
+      </w:tblGrid>
+      <w:tr>
+        <w:trPr>
+          <w:tblHeader/>
+        </w:trPr>
+        <w:tc>
+          <w:tcPr>
+            <w:tcW w:type="dxa" w:w="5060"/>
+            <w:shd w:fill="2E7D6B" w:val="clear"/>
+            <w:tcMar>
+              <w:top w:type="dxa" w:w="50"/>
+              <w:left w:type="dxa" w:w="90"/>
+              <w:bottom w:type="dxa" w:w="50"/>
+              <w:right w:type="dxa" w:w="90"/>
+            </w:tcMar>
+          </w:tcPr>
+          <w:p>
+            <w:r>
+              <w:rPr>
+                <w:b/>
+                <w:bCs/>
+                <w:color w:val="FFFFFF"/>
+                <w:sz w:val="18"/>
+                <w:szCs w:val="18"/>
+              </w:rPr>
+              <w:t xml:space="preserve">Expérience</w:t>
+            </w:r>
+          </w:p>
+        </w:tc>
+        <w:tc>
+          <w:tcPr>
+            <w:tcW w:type="dxa" w:w="4140"/>
+            <w:shd w:fill="2E7D6B" w:val="clear"/>
+            <w:tcMar>
+              <w:top w:type="dxa" w:w="50"/>
+              <w:left w:type="dxa" w:w="90"/>
+              <w:bottom w:type="dxa" w:w="50"/>
+              <w:right w:type="dxa" w:w="90"/>
+            </w:tcMar>
+          </w:tcPr>
+          <w:p>
+            <w:r>
+              <w:rPr>
+                <w:b/>
+                <w:bCs/>
+                <w:color w:val="FFFFFF"/>
+                <w:sz w:val="18"/>
+                <w:szCs w:val="18"/>
+              </w:rPr>
+              <w:t xml:space="preserve">Ce qu'elle falsifie/confirme</w:t>
+            </w:r>
+          </w:p>
+        </w:tc>
+      </w:tr>
+      <w:tr>
+        <w:trPr>
+          <w:tblHeader w:val="false"/>
+        </w:trPr>
+        <w:tc>
+          <w:tcPr>
+            <w:tcW w:type="dxa" w:w="5060"/>
+            <w:tcMar>
+              <w:top w:type="dxa" w:w="50"/>
+              <w:left w:type="dxa" w:w="90"/>
+              <w:bottom w:type="dxa" w:w="50"/>
+              <w:right w:type="dxa" w:w="90"/>
+            </w:tcMar>
+          </w:tcPr>
+          <w:p>
+            <w:r>
+              <w:rPr>
+                <w:b w:val="false"/>
+                <w:bCs w:val="false"/>
+                <w:color w:val="000000"/>
+                <w:sz w:val="18"/>
+                <w:szCs w:val="18"/>
+              </w:rPr>
+              <w:t xml:space="preserve">1. Réplication réseau long+court baseline (façon Hrysiewicz, hors MintPy)</w:t>
+            </w:r>
+          </w:p>
+        </w:tc>
+        <w:tc>
+          <w:tcPr>
+            <w:tcW w:type="dxa" w:w="4140"/>
+            <w:tcMar>
+              <w:top w:type="dxa" w:w="50"/>
+              <w:left w:type="dxa" w:w="90"/>
+              <w:bottom w:type="dxa" w:w="50"/>
+              <w:right w:type="dxa" w:w="90"/>
+            </w:tcMar>
+          </w:tcPr>
+          <w:p>
+            <w:r>
+              <w:rPr>
+                <w:b w:val="false"/>
+                <w:bCs w:val="false"/>
+                <w:color w:val="000000"/>
+                <w:sz w:val="18"/>
+                <w:szCs w:val="18"/>
+              </w:rPr>
+              <w:t xml:space="preserve">Sépare cause-site de cause-méthode (§8.2)</w:t>
+            </w:r>
+          </w:p>
+        </w:tc>
+      </w:tr>
+      <w:tr>
+        <w:trPr>
+          <w:tblHeader w:val="false"/>
+        </w:trPr>
+        <w:tc>
+          <w:tcPr>
+            <w:tcW w:type="dxa" w:w="5060"/>
+            <w:shd w:fill="F0F0F0" w:val="clear"/>
+            <w:tcMar>
+              <w:top w:type="dxa" w:w="50"/>
+              <w:left w:type="dxa" w:w="90"/>
+              <w:bottom w:type="dxa" w:w="50"/>
+              <w:right w:type="dxa" w:w="90"/>
+            </w:tcMar>
+          </w:tcPr>
+          <w:p>
+            <w:r>
+              <w:rPr>
+                <w:b w:val="false"/>
+                <w:bCs w:val="false"/>
+                <w:color w:val="000000"/>
+                <w:sz w:val="18"/>
+                <w:szCs w:val="18"/>
+              </w:rPr>
+              <w:t xml:space="preserve">2. Comparaison série InSAR vs laser au pixel (test de la respiration)</w:t>
+            </w:r>
+          </w:p>
+        </w:tc>
+        <w:tc>
+          <w:tcPr>
+            <w:tcW w:type="dxa" w:w="4140"/>
+            <w:shd w:fill="F0F0F0" w:val="clear"/>
+            <w:tcMar>
+              <w:top w:type="dxa" w:w="50"/>
+              <w:left w:type="dxa" w:w="90"/>
+              <w:bottom w:type="dxa" w:w="50"/>
+              <w:right w:type="dxa" w:w="90"/>
+            </w:tcMar>
+          </w:tcPr>
+          <w:p>
+            <w:r>
+              <w:rPr>
+                <w:b w:val="false"/>
+                <w:bCs w:val="false"/>
+                <w:color w:val="000000"/>
+                <w:sz w:val="18"/>
+                <w:szCs w:val="18"/>
+              </w:rPr>
+              <w:t xml:space="preserve">Test décisif : C-band fonctionne-t-il ici ?</w:t>
+            </w:r>
+          </w:p>
+        </w:tc>
+      </w:tr>
+      <w:tr>
+        <w:trPr>
+          <w:tblHeader w:val="false"/>
+        </w:trPr>
+        <w:tc>
+          <w:tcPr>
+            <w:tcW w:type="dxa" w:w="5060"/>
+            <w:tcMar>
+              <w:top w:type="dxa" w:w="50"/>
+              <w:left w:type="dxa" w:w="90"/>
+              <w:bottom w:type="dxa" w:w="50"/>
+              <w:right w:type="dxa" w:w="90"/>
+            </w:tcMar>
+          </w:tcPr>
+          <w:p>
+            <w:r>
+              <w:rPr>
+                <w:b w:val="false"/>
+                <w:bCs w:val="false"/>
+                <w:color w:val="000000"/>
+                <w:sz w:val="18"/>
+                <w:szCs w:val="18"/>
+              </w:rPr>
+              <w:t xml:space="preserve">3. Stratification cohérence vs nappe / inondation / phénologie S2</w:t>
+            </w:r>
+          </w:p>
+        </w:tc>
+        <w:tc>
+          <w:tcPr>
+            <w:tcW w:type="dxa" w:w="4140"/>
+            <w:tcMar>
+              <w:top w:type="dxa" w:w="50"/>
+              <w:left w:type="dxa" w:w="90"/>
+              <w:bottom w:type="dxa" w:w="50"/>
+              <w:right w:type="dxa" w:w="90"/>
+            </w:tcMar>
+          </w:tcPr>
+          <w:p>
+            <w:r>
+              <w:rPr>
+                <w:b w:val="false"/>
+                <w:bCs w:val="false"/>
+                <w:color w:val="000000"/>
+                <w:sz w:val="18"/>
+                <w:szCs w:val="18"/>
+              </w:rPr>
+              <w:t xml:space="preserve">Teste « inondé = décorrélé » (§8.4)</w:t>
+            </w:r>
+          </w:p>
+        </w:tc>
+      </w:tr>
+      <w:tr>
+        <w:trPr>
+          <w:tblHeader w:val="false"/>
+        </w:trPr>
+        <w:tc>
+          <w:tcPr>
+            <w:tcW w:type="dxa" w:w="5060"/>
+            <w:shd w:fill="F0F0F0" w:val="clear"/>
+            <w:tcMar>
+              <w:top w:type="dxa" w:w="50"/>
+              <w:left w:type="dxa" w:w="90"/>
+              <w:bottom w:type="dxa" w:w="50"/>
+              <w:right w:type="dxa" w:w="90"/>
+            </w:tcMar>
+          </w:tcPr>
+          <w:p>
+            <w:r>
+              <w:rPr>
+                <w:b w:val="false"/>
+                <w:bCs w:val="false"/>
+                <w:color w:val="000000"/>
+                <w:sz w:val="18"/>
+                <w:szCs w:val="18"/>
+              </w:rPr>
+              <w:t xml:space="preserve">4. DS-InSAR / PSI sur diffuseurs stables (passerelles, instruments)</w:t>
+            </w:r>
+          </w:p>
+        </w:tc>
+        <w:tc>
+          <w:tcPr>
+            <w:tcW w:type="dxa" w:w="4140"/>
+            <w:shd w:fill="F0F0F0" w:val="clear"/>
+            <w:tcMar>
+              <w:top w:type="dxa" w:w="50"/>
+              <w:left w:type="dxa" w:w="90"/>
+              <w:bottom w:type="dxa" w:w="50"/>
+              <w:right w:type="dxa" w:w="90"/>
+            </w:tcMar>
+          </w:tcPr>
+          <w:p>
+            <w:r>
+              <w:rPr>
+                <w:b w:val="false"/>
+                <w:bCs w:val="false"/>
+                <w:color w:val="000000"/>
+                <w:sz w:val="18"/>
+                <w:szCs w:val="18"/>
+              </w:rPr>
+              <w:t xml:space="preserve">Ancre une référence fiable (manquait à MintPy)</w:t>
+            </w:r>
+          </w:p>
+        </w:tc>
+      </w:tr>
+      <w:tr>
+        <w:trPr>
+          <w:tblHeader w:val="false"/>
+        </w:trPr>
+        <w:tc>
+          <w:tcPr>
+            <w:tcW w:type="dxa" w:w="5060"/>
+            <w:tcMar>
+              <w:top w:type="dxa" w:w="50"/>
+              <w:left w:type="dxa" w:w="90"/>
+              <w:bottom w:type="dxa" w:w="50"/>
+              <w:right w:type="dxa" w:w="90"/>
+            </w:tcMar>
+          </w:tcPr>
+          <w:p>
+            <w:r>
+              <w:rPr>
+                <w:b w:val="false"/>
+                <w:bCs w:val="false"/>
+                <w:color w:val="000000"/>
+                <w:sz w:val="18"/>
+                <w:szCs w:val="18"/>
+              </w:rPr>
+              <w:t xml:space="preserve">5. Budget SNR quantitatif (dispersion sur zones stables)</w:t>
+            </w:r>
+          </w:p>
+        </w:tc>
+        <w:tc>
+          <w:tcPr>
+            <w:tcW w:type="dxa" w:w="4140"/>
+            <w:tcMar>
+              <w:top w:type="dxa" w:w="50"/>
+              <w:left w:type="dxa" w:w="90"/>
+              <w:bottom w:type="dxa" w:w="50"/>
+              <w:right w:type="dxa" w:w="90"/>
+            </w:tcMar>
+          </w:tcPr>
+          <w:p>
+            <w:r>
+              <w:rPr>
+                <w:b w:val="false"/>
+                <w:bCs w:val="false"/>
+                <w:color w:val="000000"/>
+                <w:sz w:val="18"/>
+                <w:szCs w:val="18"/>
+              </w:rPr>
+              <w:t xml:space="preserve">« ≈ 0 » = détection ou non-détection ? (§8.5)</w:t>
+            </w:r>
+          </w:p>
+        </w:tc>
+      </w:tr>
+      <w:tr>
+        <w:trPr>
+          <w:tblHeader w:val="false"/>
+        </w:trPr>
+        <w:tc>
+          <w:tcPr>
+            <w:tcW w:type="dxa" w:w="5060"/>
+            <w:shd w:fill="F0F0F0" w:val="clear"/>
+            <w:tcMar>
+              <w:top w:type="dxa" w:w="50"/>
+              <w:left w:type="dxa" w:w="90"/>
+              <w:bottom w:type="dxa" w:w="50"/>
+              <w:right w:type="dxa" w:w="90"/>
+            </w:tcMar>
+          </w:tcPr>
+          <w:p>
+            <w:r>
+              <w:rPr>
+                <w:b w:val="false"/>
+                <w:bCs w:val="false"/>
+                <w:color w:val="000000"/>
+                <w:sz w:val="18"/>
+                <w:szCs w:val="18"/>
+              </w:rPr>
+              <w:t xml:space="preserve">6. Validation croisée drone (DoD dé-aliasé par la nappe)</w:t>
+            </w:r>
+          </w:p>
+        </w:tc>
+        <w:tc>
+          <w:tcPr>
+            <w:tcW w:type="dxa" w:w="4140"/>
+            <w:shd w:fill="F0F0F0" w:val="clear"/>
+            <w:tcMar>
+              <w:top w:type="dxa" w:w="50"/>
+              <w:left w:type="dxa" w:w="90"/>
+              <w:bottom w:type="dxa" w:w="50"/>
+              <w:right w:type="dxa" w:w="90"/>
+            </w:tcMar>
+          </w:tcPr>
+          <w:p>
+            <w:r>
+              <w:rPr>
+                <w:b w:val="false"/>
+                <w:bCs w:val="false"/>
+                <w:color w:val="000000"/>
+                <w:sz w:val="18"/>
+                <w:szCs w:val="18"/>
+              </w:rPr>
+              <w:t xml:space="preserve">Arbitre externe du signe et de l'ordre de grandeur</w:t>
+            </w:r>
+          </w:p>
+        </w:tc>
+      </w:tr>
+    </w:tbl>
+    <w:p>
+      <w:pPr>
+        <w:spacing w:after="120"/>
+      </w:pPr>
+      <w:r>
+        <w:t xml:space="preserve">[INT] Le test 2 est le plus discriminant : si l'InSAR récupère la respiration au point laser (comme les caméras de Hrysiewicz) même sans trend net fiable, alors la bande C fonctionne ici et seul le trend est limité par le SNR ; sinon, le cœur du fen est génuinement décorrélé.</w:t>
+      </w:r>
+    </w:p>
+    <w:p>
+      <w:pPr>
+        <w:pStyle w:val="Heading2"/>
+        <w:spacing w:after="150" w:before="300"/>
+      </w:pPr>
+      <w:r>
+        <w:t xml:space="preserve">8.7 Biais identifiés dans notre propre démarche</w:t>
+      </w:r>
+    </w:p>
+    <w:p>
+      <w:pPr>
+        <w:pStyle w:val="ListParagraph"/>
+        <w:numPr>
+          <w:ilvl w:val="0"/>
+          <w:numId w:val="1"/>
+        </w:numPr>
+        <w:spacing w:after="60"/>
+      </w:pPr>
+      <w:r>
+        <w:t xml:space="preserve">Biais de confirmation : après l'échec MintPy, recherche de raisons « physiques » et sous-pondération des succès publiés en C-band ;</w:t>
+      </w:r>
+    </w:p>
+    <w:p>
+      <w:pPr>
+        <w:pStyle w:val="ListParagraph"/>
+        <w:numPr>
+          <w:ilvl w:val="0"/>
+          <w:numId w:val="1"/>
+        </w:numPr>
+        <w:spacing w:after="60"/>
+      </w:pPr>
+      <w:r>
+        <w:t xml:space="preserve">Biais de disponibilité : comparaison calquée sur Biebrza (drainé) car article en main, alors que les analogues pertinents sont les bogs suivis par caméra (Hrysiewicz) ;</w:t>
+      </w:r>
+    </w:p>
+    <w:p>
+      <w:pPr>
+        <w:pStyle w:val="ListParagraph"/>
+        <w:numPr>
+          <w:ilvl w:val="0"/>
+          <w:numId w:val="1"/>
+        </w:numPr>
+        <w:spacing w:after="60"/>
+      </w:pPr>
+      <w:r>
+        <w:t xml:space="preserve">Biais de méthode unique : un seul design de réseau (court), sous MintPy seul, sans ISCE/GAMMA/StaMPS/DS-InSAR en comparaison ;</w:t>
+      </w:r>
+    </w:p>
+    <w:p>
+      <w:pPr>
+        <w:pStyle w:val="ListParagraph"/>
+        <w:numPr>
+          <w:ilvl w:val="0"/>
+          <w:numId w:val="1"/>
+        </w:numPr>
+        <w:spacing w:after="60"/>
+      </w:pPr>
+      <w:r>
+        <w:t xml:space="preserve">Sur-généralisation : d'un échec sur un site/une config vers « la bande C ne peut pas ».</w:t>
+      </w:r>
+    </w:p>
+    <w:p>
+      <w:pPr>
+        <w:pStyle w:val="Heading1"/>
+        <w:spacing w:after="200" w:before="400"/>
+      </w:pPr>
+      <w:r>
+        <w:t xml:space="preserve">9. Réorientation stratégique : une architecture qui respecte la physique</w:t>
       </w:r>
     </w:p>
     <w:p>
@@ -4502,7 +5643,7 @@
         <w:spacing w:after="200" w:before="400"/>
       </w:pPr>
       <w:r>
-        <w:t xml:space="preserve">9. Le rôle reformulé — et toujours essentiel — de Sentinel-1/2</w:t>
+        <w:t xml:space="preserve">10. Le rôle reformulé — et toujours essentiel — de Sentinel-1/2</w:t>
       </w:r>
     </w:p>
     <w:p>
@@ -4576,7 +5717,7 @@
         <w:spacing w:after="200" w:before="400"/>
       </w:pPr>
       <w:r>
-        <w:t xml:space="preserve">10. Sources et outils alternatifs évalués</w:t>
+        <w:t xml:space="preserve">11. Sources et outils alternatifs évalués</w:t>
       </w:r>
     </w:p>
     <w:p>
@@ -4776,7 +5917,7 @@
         <w:spacing w:after="200" w:before="400"/>
       </w:pPr>
       <w:r>
-        <w:t xml:space="preserve">11. Hypothèses que nous avions négligées</w:t>
+        <w:t xml:space="preserve">12. Hypothèses que nous avions négligées</w:t>
       </w:r>
     </w:p>
     <w:tbl>
@@ -5256,7 +6397,7 @@
         <w:spacing w:after="200" w:before="400"/>
       </w:pPr>
       <w:r>
-        <w:t xml:space="preserve">12. Recommandations et plan d'action</w:t>
+        <w:t xml:space="preserve">13. Recommandations et plan d'action</w:t>
       </w:r>
     </w:p>
     <w:p>
@@ -5789,7 +6930,7 @@
         <w:spacing w:after="200" w:before="400"/>
       </w:pPr>
       <w:r>
-        <w:t xml:space="preserve">13. Évaluation critique de la stratégie globale</w:t>
+        <w:t xml:space="preserve">14. Évaluation critique de la stratégie globale</w:t>
       </w:r>
     </w:p>
     <w:p>
@@ -5911,7 +7052,7 @@
         <w:spacing w:after="200" w:before="400"/>
       </w:pPr>
       <w:r>
-        <w:t xml:space="preserve">14. Conclusion et perspectives</w:t>
+        <w:t xml:space="preserve">15. Conclusion et perspectives</w:t>
       </w:r>
     </w:p>
     <w:p>
@@ -6457,7 +7598,7 @@
         <w:spacing w:after="60"/>
       </w:pPr>
       <w:r>
-        <w:t xml:space="preserve">notebooks/phase01–15 et phase01b–04b — chaîne complète reproductible ;</w:t>
+        <w:t xml:space="preserve">docs/revue_critique_litterature.md — revue critique détaillée avec étiquetage fait/hypothèse/interprétation et références ;</w:t>
       </w:r>
     </w:p>
     <w:p>
@@ -6470,7 +7611,133 @@
         <w:spacing w:after="60"/>
       </w:pPr>
       <w:r>
+        <w:t xml:space="preserve">notebooks/phase01–15 et phase01b–04b — chaîne complète reproductible ;</w:t>
+      </w:r>
+    </w:p>
+    <w:p>
+      <w:pPr>
+        <w:pStyle w:val="ListParagraph"/>
+        <w:numPr>
+          <w:ilvl w:val="0"/>
+          <w:numId w:val="1"/>
+        </w:numPr>
+        <w:spacing w:after="60"/>
+      </w:pPr>
+      <w:r>
         <w:t xml:space="preserve">Ce rapport — synthèse générale.</w:t>
+      </w:r>
+    </w:p>
+    <w:p>
+      <w:pPr>
+        <w:pStyle w:val="Heading2"/>
+        <w:spacing w:after="150" w:before="300"/>
+      </w:pPr>
+      <w:r>
+        <w:t xml:space="preserve">D. Références clés mobilisées</w:t>
+      </w:r>
+    </w:p>
+    <w:p>
+      <w:pPr>
+        <w:pStyle w:val="ListParagraph"/>
+        <w:numPr>
+          <w:ilvl w:val="0"/>
+          <w:numId w:val="1"/>
+        </w:numPr>
+        <w:spacing w:after="60"/>
+      </w:pPr>
+      <w:r>
+        <w:t xml:space="preserve">Hrysiewicz A. et al. (2024). Estimation and validation of InSAR-derived surface displacements at temperate raised peatlands. Remote Sensing of Environment 291 (C-band, r=0.8–0.9, RMSE ~7 mm/an, respiration 10–40 mm).</w:t>
+      </w:r>
+    </w:p>
+    <w:p>
+      <w:pPr>
+        <w:pStyle w:val="ListParagraph"/>
+        <w:numPr>
+          <w:ilvl w:val="0"/>
+          <w:numId w:val="1"/>
+        </w:numPr>
+        <w:spacing w:after="60"/>
+      </w:pPr>
+      <w:r>
+        <w:t xml:space="preserve">Hong S.-H., Wdowinski S. (2014). Double-bounce component in cross-polarimetric SAR. IEEE TGRS (mécanisme double-bounce en zone humide).</w:t>
+      </w:r>
+    </w:p>
+    <w:p>
+      <w:pPr>
+        <w:pStyle w:val="ListParagraph"/>
+        <w:numPr>
+          <w:ilvl w:val="0"/>
+          <w:numId w:val="1"/>
+        </w:numPr>
+        <w:spacing w:after="60"/>
+      </w:pPr>
+      <w:r>
+        <w:t xml:space="preserve">Wdowinski S., Hong S.-H. Wetland InSAR: a review of the technique and applications (phase = niveau d'eau sur végétation inondée).</w:t>
+      </w:r>
+    </w:p>
+    <w:p>
+      <w:pPr>
+        <w:pStyle w:val="ListParagraph"/>
+        <w:numPr>
+          <w:ilvl w:val="0"/>
+          <w:numId w:val="1"/>
+        </w:numPr>
+        <w:spacing w:after="60"/>
+      </w:pPr>
+      <w:r>
+        <w:t xml:space="preserve">Ghezelayagh P. et al. (2024). Ecological Indicators 166:112305 (Biebrza, seasonal-annual, −1.44 cm/an — fen drainé, référence initiale).</w:t>
+      </w:r>
+    </w:p>
+    <w:p>
+      <w:pPr>
+        <w:pStyle w:val="ListParagraph"/>
+        <w:numPr>
+          <w:ilvl w:val="0"/>
+          <w:numId w:val="1"/>
+        </w:numPr>
+        <w:spacing w:after="60"/>
+      </w:pPr>
+      <w:r>
+        <w:t xml:space="preserve">« Modelling water table depth at rewetted peatlands with Sentinel-1 and Sentinel-2 » (2025) — appui direct à la reformulation covariable.</w:t>
+      </w:r>
+    </w:p>
+    <w:p>
+      <w:pPr>
+        <w:pStyle w:val="ListParagraph"/>
+        <w:numPr>
+          <w:ilvl w:val="0"/>
+          <w:numId w:val="1"/>
+        </w:numPr>
+        <w:spacing w:after="60"/>
+      </w:pPr>
+      <w:r>
+        <w:t xml:space="preserve">« Sentinel-1 interferometric coherence as a vegetation index » (2022), Remote Sensing of Environment.</w:t>
+      </w:r>
+    </w:p>
+    <w:p>
+      <w:pPr>
+        <w:pStyle w:val="ListParagraph"/>
+        <w:numPr>
+          <w:ilvl w:val="0"/>
+          <w:numId w:val="1"/>
+        </w:numPr>
+        <w:spacing w:after="60"/>
+      </w:pPr>
+      <w:r>
+        <w:t xml:space="preserve">Étude PlanetScope sur Rzecin (2017–2023), MDPI Remote Sensing 18(4):593, 2026 (EVI/phénologie vs nappe).</w:t>
+      </w:r>
+    </w:p>
+    <w:p>
+      <w:pPr>
+        <w:pStyle w:val="ListParagraph"/>
+        <w:numPr>
+          <w:ilvl w:val="0"/>
+          <w:numId w:val="1"/>
+        </w:numPr>
+        <w:spacing w:after="60"/>
+      </w:pPr>
+      <w:r>
+        <w:t xml:space="preserve">Revue « Remote sensing of peatland degradation in temperate and boreal zones » (2024), Ecological Indicators.</w:t>
       </w:r>
     </w:p>
     <w:sectPr>

</xml_diff>

<commit_message>
Rapport: ajoute la revue par comité (section 16) et la feuille de route (section 17)
- Section 16: auto-evaluation critique 6 reviewers (radar/InSAR, site/hydro/
  ecologie, geodesie/stats, transversal) au standard RSE/ISPRS/Nature Comms
- Section 17: 2 cadres de publication + checklist priorisee 6 blocs + barre
  Nature Communications
- Correction factuelle du site (section 1.2, 8.3, resume): nappe 0-30cm SOUS
  la surface sur tapis Sphagnum flottant stable (Juszczak 2013), non 'au-dessus
  de la vegetation'
- Annexes: doc comite + references site Rzecin ajoutees
</commit_message>
<xml_diff>
--- a/reports/Rapport_General_Rzecin.docx
+++ b/reports/Rapport_General_Rzecin.docx
@@ -156,7 +156,7 @@
         <w:t xml:space="preserve">Nous ne pouvons PAS attribuer cet échec à une impossibilité physique de la bande C</w:t>
       </w:r>
       <w:r>
-        <w:t xml:space="preserve"> : des équipes mesurent la respiration de tourbières en C-band avec une précision de quelques mm (Hrysiewicz et al. 2024, RSE). Deux causes restent NON séparées — le régime hydrologique inondé du fen, et nos choix de méthode (réseau court uniquement, VV, petite AOI). La stratégie robuste demeure : le vertical net vient des capteurs géodésiques (drone, laser) ; Sentinel-1/2 comme </w:t>
+        <w:t xml:space="preserve"> : des équipes mesurent la respiration de tourbières en C-band avec une précision de quelques mm (Hrysiewicz et al. 2024, RSE). Deux causes restent NON séparées — le régime hydrologique particulier (tapis de Sphagnum flottant), et nos choix de méthode (réseau court uniquement, VV, petite AOI). La stratégie robuste demeure : le vertical net vient des capteurs géodésiques (drone, laser) ; Sentinel-1/2 comme </w:t>
       </w:r>
       <w:r>
         <w:rPr>
@@ -657,7 +657,7 @@
         <w:spacing w:after="60"/>
       </w:pPr>
       <w:r>
-        <w:t xml:space="preserve">Présence d'un lac résiduel au centre et de plans d'eau libre ;</w:t>
+        <w:t xml:space="preserve">Présence d'un lac résiduel au centre et de plans d'eau libre localisés ;</w:t>
       </w:r>
     </w:p>
     <w:p>
@@ -670,7 +670,7 @@
         <w:spacing w:after="60"/>
       </w:pPr>
       <w:r>
-        <w:t xml:space="preserve">Nappe phréatique affleurante à émergente : par endroits, l'eau recouvre la végétation ;</w:t>
+        <w:t xml:space="preserve">Tapis de Sphagnum flottant (Schwingmoor) issu de terrestrialisation, sur plusieurs mètres de tourbe : la surface flotte et suit la nappe par poussée d'Archimède ;</w:t>
       </w:r>
     </w:p>
     <w:p>
@@ -683,7 +683,7 @@
         <w:spacing w:after="60"/>
       </w:pPr>
       <w:r>
-        <w:t xml:space="preserve">Tapis de végétation flottant (Schwingmoor / quaking bog) : la surface flotte et suit la nappe par poussée d'Archimède.</w:t>
+        <w:t xml:space="preserve">[CORRECTION — littérature du site, Juszczak et al. 2013] Nappe typiquement à 0–30 cm SOUS la surface en saison de croissance (non « au-dessus de la végétation »), avec une STABILITÉ hydrologique exceptionnelle, résistante aux phases sèches. L'eau libre au-dessus de la végétation concerne le lac et les dépressions, pas l'ensemble du fen.</w:t>
       </w:r>
     </w:p>
     <w:p>
@@ -4639,7 +4639,7 @@
         <w:spacing w:after="150" w:before="300"/>
       </w:pPr>
       <w:r>
-        <w:t xml:space="preserve">8.3 La différence de site : bog non inondé vs fen inondé (l'hypothèse à tester)</w:t>
+        <w:t xml:space="preserve">8.3 La différence de site : moins tranchée qu'annoncé (correction)</w:t>
       </w:r>
     </w:p>
     <w:p>
@@ -4647,7 +4647,7 @@
         <w:spacing w:after="120"/>
       </w:pPr>
       <w:r>
-        <w:t xml:space="preserve">[FAIT] Les sites où l'InSAR C-band réussit sont des bogs ombrotrophes (nappe SOUS la surface, tapis non inondé). Rzecin est un fen transitionnel minerotrophe à nappe affleurante/émergente. [HYP] Le régime hydrologique (inondé vs non), et non la bande, serait le vrai discriminant — hypothèse testable (§8.6), non démontrée à ce stade.</w:t>
+        <w:t xml:space="preserve">[FAIT] Les sites où l'InSAR C-band réussit sont des bogs ombrotrophes à Sphagnum (nappe sous la surface). [FAIT — correction] La littérature du site indique que Rzecin est lui aussi un tapis de SPHAGNUM flottant à nappe 0–30 cm sous la surface, hydrologiquement stable (Juszczak et al. 2013) — donc PLUS proche des bogs où l'InSAR réussit que d'un marais inondé. [INT] Cela AFFAIBLIT notre argument « régime inondé = inobservable » (valable surtout pour le lac et les dépressions) et RENFORCE l'hypothèse « échec = méthode » (réseau court, VV, petite AOI). Le vrai discriminant reste à établir expérimentalement (§8.6).</w:t>
       </w:r>
     </w:p>
     <w:p>
@@ -7100,6 +7100,1114 @@
         <w:spacing w:after="200" w:before="400"/>
       </w:pPr>
       <w:r>
+        <w:t xml:space="preserve">16. Revue par comité scientifique (auto-évaluation critique)</w:t>
+      </w:r>
+    </w:p>
+    <w:p>
+      <w:pPr>
+        <w:spacing w:after="120"/>
+      </w:pPr>
+      <w:r>
+        <w:t xml:space="preserve">Le rapport a été soumis à une revue interne simulant un panel de reviewers spécialisés (physique radar/InSAR, télédétection des zones humides, hydrologie des tourbières, géodésie/validation, statistiques, écologie), au standard RSE / ISPRS J. / Nature Communications. Recommandation éditoriale simulée : major revision. Faiblesses principales à corriger avant toute soumission :</w:t>
+      </w:r>
+    </w:p>
+    <w:p>
+      <w:pPr>
+        <w:pStyle w:val="Heading2"/>
+        <w:spacing w:after="150" w:before="300"/>
+      </w:pPr>
+      <w:r>
+        <w:t xml:space="preserve">16.1 Physique radar / InSAR</w:t>
+      </w:r>
+    </w:p>
+    <w:p>
+      <w:pPr>
+        <w:pStyle w:val="ListParagraph"/>
+        <w:numPr>
+          <w:ilvl w:val="0"/>
+          <w:numId w:val="1"/>
+        </w:numPr>
+        <w:spacing w:after="60"/>
+      </w:pPr>
+      <w:r>
+        <w:t xml:space="preserve">[Majeur] Le résultat InSAR est une non-détection non diagnostiquée : aucune courbe de décorrélation cohérence vs ligne de base mesurée ;</w:t>
+      </w:r>
+    </w:p>
+    <w:p>
+      <w:pPr>
+        <w:pStyle w:val="ListParagraph"/>
+        <w:numPr>
+          <w:ilvl w:val="0"/>
+          <w:numId w:val="1"/>
+        </w:numPr>
+        <w:spacing w:after="60"/>
+      </w:pPr>
+      <w:r>
+        <w:t xml:space="preserve">[Majeur] Réseau ≤48 j seulement — le réseau long+court baseline des études qui réussissent (Hrysiewicz) n'a jamais été testé ;</w:t>
+      </w:r>
+    </w:p>
+    <w:p>
+      <w:pPr>
+        <w:pStyle w:val="ListParagraph"/>
+        <w:numPr>
+          <w:ilvl w:val="0"/>
+          <w:numId w:val="1"/>
+        </w:numPr>
+        <w:spacing w:after="60"/>
+      </w:pPr>
+      <w:r>
+        <w:t xml:space="preserve">[Majeur] Point de référence jamais validé sur un site flottant (ni GNSS, ni nivellement, ni laser) ;</w:t>
+      </w:r>
+    </w:p>
+    <w:p>
+      <w:pPr>
+        <w:pStyle w:val="ListParagraph"/>
+        <w:numPr>
+          <w:ilvl w:val="0"/>
+          <w:numId w:val="1"/>
+        </w:numPr>
+        <w:spacing w:after="60"/>
+      </w:pPr>
+      <w:r>
+        <w:t xml:space="preserve">[Majeur] Correction atmosphérique par simple plan (rampes jusqu'à 179 mm/an) ; GACOS/ERA5 non appliqué ;</w:t>
+      </w:r>
+    </w:p>
+    <w:p>
+      <w:pPr>
+        <w:pStyle w:val="ListParagraph"/>
+        <w:numPr>
+          <w:ilvl w:val="0"/>
+          <w:numId w:val="1"/>
+        </w:numPr>
+        <w:spacing w:after="60"/>
+      </w:pPr>
+      <w:r>
+        <w:t xml:space="preserve">[Majeur] Erreurs de déroulement non contrôlées (changement de signe des paires 2 ans) ; fermeture de phase non rapportée.</w:t>
+      </w:r>
+    </w:p>
+    <w:p>
+      <w:pPr>
+        <w:pStyle w:val="Heading2"/>
+        <w:spacing w:after="150" w:before="300"/>
+      </w:pPr>
+      <w:r>
+        <w:t xml:space="preserve">16.2 Site, hydrologie et écologie</w:t>
+      </w:r>
+    </w:p>
+    <w:p>
+      <w:pPr>
+        <w:pStyle w:val="ListParagraph"/>
+        <w:numPr>
+          <w:ilvl w:val="0"/>
+          <w:numId w:val="1"/>
+        </w:numPr>
+        <w:spacing w:after="60"/>
+      </w:pPr>
+      <w:r>
+        <w:t xml:space="preserve">[Majeur — corrigé §1.2] Hydrologie du site mal décrite : nappe 0–30 cm sous la surface sur tapis Sphagnum flottant stable, non « au-dessus de la végétation » ;</w:t>
+      </w:r>
+    </w:p>
+    <w:p>
+      <w:pPr>
+        <w:pStyle w:val="ListParagraph"/>
+        <w:numPr>
+          <w:ilvl w:val="0"/>
+          <w:numId w:val="1"/>
+        </w:numPr>
+        <w:spacing w:after="60"/>
+      </w:pPr>
+      <w:r>
+        <w:t xml:space="preserve">[Majeur] Données in situ existantes NON utilisées : WTD et flux de GES du site eddy-covariance de Rzecin ;</w:t>
+      </w:r>
+    </w:p>
+    <w:p>
+      <w:pPr>
+        <w:pStyle w:val="ListParagraph"/>
+        <w:numPr>
+          <w:ilvl w:val="0"/>
+          <w:numId w:val="1"/>
+        </w:numPr>
+        <w:spacing w:after="60"/>
+      </w:pPr>
+      <w:r>
+        <w:t xml:space="preserve">[Majeur] Contexte climatique absent (sécheresse 2022) ; classes A–E non validées (raisonnement circulaire) ;</w:t>
+      </w:r>
+    </w:p>
+    <w:p>
+      <w:pPr>
+        <w:pStyle w:val="ListParagraph"/>
+        <w:numPr>
+          <w:ilvl w:val="0"/>
+          <w:numId w:val="1"/>
+        </w:numPr>
+        <w:spacing w:after="60"/>
+      </w:pPr>
+      <w:r>
+        <w:t xml:space="preserve">[Majeur] Littérature propre au site absente (Juszczak, Lamentowicz, Chojnicki, groupe PEATBOG).</w:t>
+      </w:r>
+    </w:p>
+    <w:p>
+      <w:pPr>
+        <w:pStyle w:val="Heading2"/>
+        <w:spacing w:after="150" w:before="300"/>
+      </w:pPr>
+      <w:r>
+        <w:t xml:space="preserve">16.3 Géodésie, validation et statistiques</w:t>
+      </w:r>
+    </w:p>
+    <w:p>
+      <w:pPr>
+        <w:pStyle w:val="ListParagraph"/>
+        <w:numPr>
+          <w:ilvl w:val="0"/>
+          <w:numId w:val="1"/>
+        </w:numPr>
+        <w:spacing w:after="60"/>
+      </w:pPr>
+      <w:r>
+        <w:t xml:space="preserve">[Majeur] Validation N=1 (un seul point laser) : aucune statistique spatiale possible ;</w:t>
+      </w:r>
+    </w:p>
+    <w:p>
+      <w:pPr>
+        <w:pStyle w:val="ListParagraph"/>
+        <w:numPr>
+          <w:ilvl w:val="0"/>
+          <w:numId w:val="1"/>
+        </w:numPr>
+        <w:spacing w:after="60"/>
+      </w:pPr>
+      <w:r>
+        <w:t xml:space="preserve">[Majeur] Budget d'erreur UAV non chiffré ; LiDAR vs photogrammétrie non tranché (DSM = canopée, ±5–15 cm &gt; signal) ;</w:t>
+      </w:r>
+    </w:p>
+    <w:p>
+      <w:pPr>
+        <w:pStyle w:val="ListParagraph"/>
+        <w:numPr>
+          <w:ilvl w:val="0"/>
+          <w:numId w:val="1"/>
+        </w:numPr>
+        <w:spacing w:after="60"/>
+      </w:pPr>
+      <w:r>
+        <w:t xml:space="preserve">[Majeur] « IQR = incertitude » incorrect (dispersion ≠ erreur-type de la médiane) ; degrés de liberté effectifs ≪ 9 (dates partagées) ;</w:t>
+      </w:r>
+    </w:p>
+    <w:p>
+      <w:pPr>
+        <w:pStyle w:val="ListParagraph"/>
+        <w:numPr>
+          <w:ilvl w:val="0"/>
+          <w:numId w:val="1"/>
+        </w:numPr>
+        <w:spacing w:after="60"/>
+      </w:pPr>
+      <w:r>
+        <w:t xml:space="preserve">[Majeur] Aucun test d'hypothèse formel (−4.5 diffère-t-il de 0 ? de −14 ?) ; deramp non validé ; biais de sélection top-k non examiné.</w:t>
+      </w:r>
+    </w:p>
+    <w:p>
+      <w:pPr>
+        <w:pStyle w:val="Heading2"/>
+        <w:spacing w:after="150" w:before="300"/>
+      </w:pPr>
+      <w:r>
+        <w:t xml:space="preserve">16.4 Transversal</w:t>
+      </w:r>
+    </w:p>
+    <w:p>
+      <w:pPr>
+        <w:pStyle w:val="ListParagraph"/>
+        <w:numPr>
+          <w:ilvl w:val="0"/>
+          <w:numId w:val="1"/>
+        </w:numPr>
+        <w:spacing w:after="60"/>
+      </w:pPr>
+      <w:r>
+        <w:t xml:space="preserve">[Majeur] Confusion de portée (méthode + site + fusion) ; la narration d'échec n'est pas une contribution tant que site-vs-méthode n'est pas isolé ;</w:t>
+      </w:r>
+    </w:p>
+    <w:p>
+      <w:pPr>
+        <w:pStyle w:val="ListParagraph"/>
+        <w:numPr>
+          <w:ilvl w:val="0"/>
+          <w:numId w:val="1"/>
+        </w:numPr>
+        <w:spacing w:after="60"/>
+      </w:pPr>
+      <w:r>
+        <w:t xml:space="preserve">[Positif] Reproductibilité forte (code, tests, git) — atout à valoriser (dépôt public, données ouvertes).</w:t>
+      </w:r>
+    </w:p>
+    <w:p>
+      <w:pPr>
+        <w:pStyle w:val="Heading1"/>
+        <w:spacing w:after="200" w:before="400"/>
+      </w:pPr>
+      <w:r>
+        <w:t xml:space="preserve">17. Feuille de route vers une étude publiable</w:t>
+      </w:r>
+    </w:p>
+    <w:p>
+      <w:pPr>
+        <w:spacing w:after="120"/>
+      </w:pPr>
+      <w:r>
+        <w:t xml:space="preserve">Deux cadres viables ; le cadre A est le plus solide et faisable, le cadre B est conditionnel à la conduite des expériences InSAR.</w:t>
+      </w:r>
+    </w:p>
+    <w:tbl>
+      <w:tblPr>
+        <w:tblW w:type="dxa" w:w="9200"/>
+        <w:tblBorders>
+          <w:top w:val="single" w:color="auto" w:sz="4"/>
+          <w:left w:val="single" w:color="auto" w:sz="4"/>
+          <w:bottom w:val="single" w:color="auto" w:sz="4"/>
+          <w:right w:val="single" w:color="auto" w:sz="4"/>
+          <w:insideH w:val="single" w:color="auto" w:sz="4"/>
+          <w:insideV w:val="single" w:color="auto" w:sz="4"/>
+        </w:tblBorders>
+      </w:tblPr>
+      <w:tblGrid>
+        <w:gridCol w:w="1840"/>
+        <w:gridCol w:w="5060"/>
+        <w:gridCol w:w="2300"/>
+      </w:tblGrid>
+      <w:tr>
+        <w:trPr>
+          <w:tblHeader/>
+        </w:trPr>
+        <w:tc>
+          <w:tcPr>
+            <w:tcW w:type="dxa" w:w="1840"/>
+            <w:shd w:fill="1F3864" w:val="clear"/>
+            <w:tcMar>
+              <w:top w:type="dxa" w:w="50"/>
+              <w:left w:type="dxa" w:w="90"/>
+              <w:bottom w:type="dxa" w:w="50"/>
+              <w:right w:type="dxa" w:w="90"/>
+            </w:tcMar>
+          </w:tcPr>
+          <w:p>
+            <w:r>
+              <w:rPr>
+                <w:b/>
+                <w:bCs/>
+                <w:color w:val="FFFFFF"/>
+                <w:sz w:val="18"/>
+                <w:szCs w:val="18"/>
+              </w:rPr>
+              <w:t xml:space="preserve">Cadre</w:t>
+            </w:r>
+          </w:p>
+        </w:tc>
+        <w:tc>
+          <w:tcPr>
+            <w:tcW w:type="dxa" w:w="5060"/>
+            <w:shd w:fill="1F3864" w:val="clear"/>
+            <w:tcMar>
+              <w:top w:type="dxa" w:w="50"/>
+              <w:left w:type="dxa" w:w="90"/>
+              <w:bottom w:type="dxa" w:w="50"/>
+              <w:right w:type="dxa" w:w="90"/>
+            </w:tcMar>
+          </w:tcPr>
+          <w:p>
+            <w:r>
+              <w:rPr>
+                <w:b/>
+                <w:bCs/>
+                <w:color w:val="FFFFFF"/>
+                <w:sz w:val="18"/>
+                <w:szCs w:val="18"/>
+              </w:rPr>
+              <w:t xml:space="preserve">Contribution</w:t>
+            </w:r>
+          </w:p>
+        </w:tc>
+        <w:tc>
+          <w:tcPr>
+            <w:tcW w:type="dxa" w:w="2300"/>
+            <w:shd w:fill="1F3864" w:val="clear"/>
+            <w:tcMar>
+              <w:top w:type="dxa" w:w="50"/>
+              <w:left w:type="dxa" w:w="90"/>
+              <w:bottom w:type="dxa" w:w="50"/>
+              <w:right w:type="dxa" w:w="90"/>
+            </w:tcMar>
+          </w:tcPr>
+          <w:p>
+            <w:r>
+              <w:rPr>
+                <w:b/>
+                <w:bCs/>
+                <w:color w:val="FFFFFF"/>
+                <w:sz w:val="18"/>
+                <w:szCs w:val="18"/>
+              </w:rPr>
+              <w:t xml:space="preserve">Cible</w:t>
+            </w:r>
+          </w:p>
+        </w:tc>
+      </w:tr>
+      <w:tr>
+        <w:trPr>
+          <w:tblHeader w:val="false"/>
+        </w:trPr>
+        <w:tc>
+          <w:tcPr>
+            <w:tcW w:type="dxa" w:w="1840"/>
+            <w:tcMar>
+              <w:top w:type="dxa" w:w="50"/>
+              <w:left w:type="dxa" w:w="90"/>
+              <w:bottom w:type="dxa" w:w="50"/>
+              <w:right w:type="dxa" w:w="90"/>
+            </w:tcMar>
+          </w:tcPr>
+          <w:p>
+            <w:r>
+              <w:rPr>
+                <w:b w:val="false"/>
+                <w:bCs w:val="false"/>
+                <w:color w:val="000000"/>
+                <w:sz w:val="18"/>
+                <w:szCs w:val="18"/>
+              </w:rPr>
+              <w:t xml:space="preserve">A (recommandé)</w:t>
+            </w:r>
+          </w:p>
+        </w:tc>
+        <w:tc>
+          <w:tcPr>
+            <w:tcW w:type="dxa" w:w="5060"/>
+            <w:tcMar>
+              <w:top w:type="dxa" w:w="50"/>
+              <w:left w:type="dxa" w:w="90"/>
+              <w:bottom w:type="dxa" w:w="50"/>
+              <w:right w:type="dxa" w:w="90"/>
+            </w:tcMar>
+          </w:tcPr>
+          <w:p>
+            <w:r>
+              <w:rPr>
+                <w:b w:val="false"/>
+                <w:bCs w:val="false"/>
+                <w:color w:val="000000"/>
+                <w:sz w:val="18"/>
+                <w:szCs w:val="18"/>
+              </w:rPr>
+              <w:t xml:space="preserve">Fusion laser–UAV–Sentinel : mouvement de surface d'un fen flottant corrigé de la nappe (respiration vs net)</w:t>
+            </w:r>
+          </w:p>
+        </w:tc>
+        <w:tc>
+          <w:tcPr>
+            <w:tcW w:type="dxa" w:w="2300"/>
+            <w:tcMar>
+              <w:top w:type="dxa" w:w="50"/>
+              <w:left w:type="dxa" w:w="90"/>
+              <w:bottom w:type="dxa" w:w="50"/>
+              <w:right w:type="dxa" w:w="90"/>
+            </w:tcMar>
+          </w:tcPr>
+          <w:p>
+            <w:r>
+              <w:rPr>
+                <w:b w:val="false"/>
+                <w:bCs w:val="false"/>
+                <w:color w:val="000000"/>
+                <w:sz w:val="18"/>
+                <w:szCs w:val="18"/>
+              </w:rPr>
+              <w:t xml:space="preserve">RSE / ISPRS J. / JGR-Biogeosciences</w:t>
+            </w:r>
+          </w:p>
+        </w:tc>
+      </w:tr>
+      <w:tr>
+        <w:trPr>
+          <w:tblHeader w:val="false"/>
+        </w:trPr>
+        <w:tc>
+          <w:tcPr>
+            <w:tcW w:type="dxa" w:w="1840"/>
+            <w:shd w:fill="F0F0F0" w:val="clear"/>
+            <w:tcMar>
+              <w:top w:type="dxa" w:w="50"/>
+              <w:left w:type="dxa" w:w="90"/>
+              <w:bottom w:type="dxa" w:w="50"/>
+              <w:right w:type="dxa" w:w="90"/>
+            </w:tcMar>
+          </w:tcPr>
+          <w:p>
+            <w:r>
+              <w:rPr>
+                <w:b w:val="false"/>
+                <w:bCs w:val="false"/>
+                <w:color w:val="000000"/>
+                <w:sz w:val="18"/>
+                <w:szCs w:val="18"/>
+              </w:rPr>
+              <w:t xml:space="preserve">B (conditionnel)</w:t>
+            </w:r>
+          </w:p>
+        </w:tc>
+        <w:tc>
+          <w:tcPr>
+            <w:tcW w:type="dxa" w:w="5060"/>
+            <w:shd w:fill="F0F0F0" w:val="clear"/>
+            <w:tcMar>
+              <w:top w:type="dxa" w:w="50"/>
+              <w:left w:type="dxa" w:w="90"/>
+              <w:bottom w:type="dxa" w:w="50"/>
+              <w:right w:type="dxa" w:w="90"/>
+            </w:tcMar>
+          </w:tcPr>
+          <w:p>
+            <w:r>
+              <w:rPr>
+                <w:b w:val="false"/>
+                <w:bCs w:val="false"/>
+                <w:color w:val="000000"/>
+                <w:sz w:val="18"/>
+                <w:szCs w:val="18"/>
+              </w:rPr>
+              <w:t xml:space="preserve">Observabilité de l'InSAR C-band selon l'hydromorphologie (bog vs fen) — cadre de décision</w:t>
+            </w:r>
+          </w:p>
+        </w:tc>
+        <w:tc>
+          <w:tcPr>
+            <w:tcW w:type="dxa" w:w="2300"/>
+            <w:shd w:fill="F0F0F0" w:val="clear"/>
+            <w:tcMar>
+              <w:top w:type="dxa" w:w="50"/>
+              <w:left w:type="dxa" w:w="90"/>
+              <w:bottom w:type="dxa" w:w="50"/>
+              <w:right w:type="dxa" w:w="90"/>
+            </w:tcMar>
+          </w:tcPr>
+          <w:p>
+            <w:r>
+              <w:rPr>
+                <w:b w:val="false"/>
+                <w:bCs w:val="false"/>
+                <w:color w:val="000000"/>
+                <w:sz w:val="18"/>
+                <w:szCs w:val="18"/>
+              </w:rPr>
+              <w:t xml:space="preserve">ISPRS J. / IEEE TGRS</w:t>
+            </w:r>
+          </w:p>
+        </w:tc>
+      </w:tr>
+    </w:tbl>
+    <w:p>
+      <w:pPr>
+        <w:pStyle w:val="Heading2"/>
+        <w:spacing w:after="150" w:before="300"/>
+      </w:pPr>
+      <w:r>
+        <w:t xml:space="preserve">17.1 Checklist priorisée en 6 blocs</w:t>
+      </w:r>
+    </w:p>
+    <w:tbl>
+      <w:tblPr>
+        <w:tblW w:type="dxa" w:w="9200"/>
+        <w:tblBorders>
+          <w:top w:val="single" w:color="auto" w:sz="4"/>
+          <w:left w:val="single" w:color="auto" w:sz="4"/>
+          <w:bottom w:val="single" w:color="auto" w:sz="4"/>
+          <w:right w:val="single" w:color="auto" w:sz="4"/>
+          <w:insideH w:val="single" w:color="auto" w:sz="4"/>
+          <w:insideV w:val="single" w:color="auto" w:sz="4"/>
+        </w:tblBorders>
+      </w:tblPr>
+      <w:tblGrid>
+        <w:gridCol w:w="2208"/>
+        <w:gridCol w:w="5520"/>
+        <w:gridCol w:w="1472"/>
+      </w:tblGrid>
+      <w:tr>
+        <w:trPr>
+          <w:tblHeader/>
+        </w:trPr>
+        <w:tc>
+          <w:tcPr>
+            <w:tcW w:type="dxa" w:w="2208"/>
+            <w:shd w:fill="2E7D6B" w:val="clear"/>
+            <w:tcMar>
+              <w:top w:type="dxa" w:w="50"/>
+              <w:left w:type="dxa" w:w="90"/>
+              <w:bottom w:type="dxa" w:w="50"/>
+              <w:right w:type="dxa" w:w="90"/>
+            </w:tcMar>
+          </w:tcPr>
+          <w:p>
+            <w:r>
+              <w:rPr>
+                <w:b/>
+                <w:bCs/>
+                <w:color w:val="FFFFFF"/>
+                <w:sz w:val="18"/>
+                <w:szCs w:val="18"/>
+              </w:rPr>
+              <w:t xml:space="preserve">Bloc</w:t>
+            </w:r>
+          </w:p>
+        </w:tc>
+        <w:tc>
+          <w:tcPr>
+            <w:tcW w:type="dxa" w:w="5520"/>
+            <w:shd w:fill="2E7D6B" w:val="clear"/>
+            <w:tcMar>
+              <w:top w:type="dxa" w:w="50"/>
+              <w:left w:type="dxa" w:w="90"/>
+              <w:bottom w:type="dxa" w:w="50"/>
+              <w:right w:type="dxa" w:w="90"/>
+            </w:tcMar>
+          </w:tcPr>
+          <w:p>
+            <w:r>
+              <w:rPr>
+                <w:b/>
+                <w:bCs/>
+                <w:color w:val="FFFFFF"/>
+                <w:sz w:val="18"/>
+                <w:szCs w:val="18"/>
+              </w:rPr>
+              <w:t xml:space="preserve">Actions</w:t>
+            </w:r>
+          </w:p>
+        </w:tc>
+        <w:tc>
+          <w:tcPr>
+            <w:tcW w:type="dxa" w:w="1472"/>
+            <w:shd w:fill="2E7D6B" w:val="clear"/>
+            <w:tcMar>
+              <w:top w:type="dxa" w:w="50"/>
+              <w:left w:type="dxa" w:w="90"/>
+              <w:bottom w:type="dxa" w:w="50"/>
+              <w:right w:type="dxa" w:w="90"/>
+            </w:tcMar>
+          </w:tcPr>
+          <w:p>
+            <w:r>
+              <w:rPr>
+                <w:b/>
+                <w:bCs/>
+                <w:color w:val="FFFFFF"/>
+                <w:sz w:val="18"/>
+                <w:szCs w:val="18"/>
+              </w:rPr>
+              <w:t xml:space="preserve">Statut</w:t>
+            </w:r>
+          </w:p>
+        </w:tc>
+      </w:tr>
+      <w:tr>
+        <w:trPr>
+          <w:tblHeader w:val="false"/>
+        </w:trPr>
+        <w:tc>
+          <w:tcPr>
+            <w:tcW w:type="dxa" w:w="2208"/>
+            <w:tcMar>
+              <w:top w:type="dxa" w:w="50"/>
+              <w:left w:type="dxa" w:w="90"/>
+              <w:bottom w:type="dxa" w:w="50"/>
+              <w:right w:type="dxa" w:w="90"/>
+            </w:tcMar>
+          </w:tcPr>
+          <w:p>
+            <w:r>
+              <w:rPr>
+                <w:b w:val="false"/>
+                <w:bCs w:val="false"/>
+                <w:color w:val="000000"/>
+                <w:sz w:val="18"/>
+                <w:szCs w:val="18"/>
+              </w:rPr>
+              <w:t xml:space="preserve">1. Corriger/documenter le site</w:t>
+            </w:r>
+          </w:p>
+        </w:tc>
+        <w:tc>
+          <w:tcPr>
+            <w:tcW w:type="dxa" w:w="5520"/>
+            <w:tcMar>
+              <w:top w:type="dxa" w:w="50"/>
+              <w:left w:type="dxa" w:w="90"/>
+              <w:bottom w:type="dxa" w:w="50"/>
+              <w:right w:type="dxa" w:w="90"/>
+            </w:tcMar>
+          </w:tcPr>
+          <w:p>
+            <w:r>
+              <w:rPr>
+                <w:b w:val="false"/>
+                <w:bCs w:val="false"/>
+                <w:color w:val="000000"/>
+                <w:sz w:val="18"/>
+                <w:szCs w:val="18"/>
+              </w:rPr>
+              <w:t xml:space="preserve">Réécrire l'hydrologie avec la littérature Rzecin ; carte végétation/microforme</w:t>
+            </w:r>
+          </w:p>
+        </w:tc>
+        <w:tc>
+          <w:tcPr>
+            <w:tcW w:type="dxa" w:w="1472"/>
+            <w:tcMar>
+              <w:top w:type="dxa" w:w="50"/>
+              <w:left w:type="dxa" w:w="90"/>
+              <w:bottom w:type="dxa" w:w="50"/>
+              <w:right w:type="dxa" w:w="90"/>
+            </w:tcMar>
+          </w:tcPr>
+          <w:p>
+            <w:r>
+              <w:rPr>
+                <w:b w:val="false"/>
+                <w:bCs w:val="false"/>
+                <w:color w:val="000000"/>
+                <w:sz w:val="18"/>
+                <w:szCs w:val="18"/>
+              </w:rPr>
+              <w:t xml:space="preserve">Rapide</w:t>
+            </w:r>
+          </w:p>
+        </w:tc>
+      </w:tr>
+      <w:tr>
+        <w:trPr>
+          <w:tblHeader w:val="false"/>
+        </w:trPr>
+        <w:tc>
+          <w:tcPr>
+            <w:tcW w:type="dxa" w:w="2208"/>
+            <w:shd w:fill="F0F0F0" w:val="clear"/>
+            <w:tcMar>
+              <w:top w:type="dxa" w:w="50"/>
+              <w:left w:type="dxa" w:w="90"/>
+              <w:bottom w:type="dxa" w:w="50"/>
+              <w:right w:type="dxa" w:w="90"/>
+            </w:tcMar>
+          </w:tcPr>
+          <w:p>
+            <w:r>
+              <w:rPr>
+                <w:b w:val="false"/>
+                <w:bCs w:val="false"/>
+                <w:color w:val="000000"/>
+                <w:sz w:val="18"/>
+                <w:szCs w:val="18"/>
+              </w:rPr>
+              <w:t xml:space="preserve">2. Données in situ</w:t>
+            </w:r>
+          </w:p>
+        </w:tc>
+        <w:tc>
+          <w:tcPr>
+            <w:tcW w:type="dxa" w:w="5520"/>
+            <w:shd w:fill="F0F0F0" w:val="clear"/>
+            <w:tcMar>
+              <w:top w:type="dxa" w:w="50"/>
+              <w:left w:type="dxa" w:w="90"/>
+              <w:bottom w:type="dxa" w:w="50"/>
+              <w:right w:type="dxa" w:w="90"/>
+            </w:tcMar>
+          </w:tcPr>
+          <w:p>
+            <w:r>
+              <w:rPr>
+                <w:b w:val="false"/>
+                <w:bCs w:val="false"/>
+                <w:color w:val="000000"/>
+                <w:sz w:val="18"/>
+                <w:szCs w:val="18"/>
+              </w:rPr>
+              <w:t xml:space="preserve">WTD 2022–2024, fonction élévation=f(WTD), contexte sécheresse 2022, lien flux GES</w:t>
+            </w:r>
+          </w:p>
+        </w:tc>
+        <w:tc>
+          <w:tcPr>
+            <w:tcW w:type="dxa" w:w="1472"/>
+            <w:shd w:fill="F0F0F0" w:val="clear"/>
+            <w:tcMar>
+              <w:top w:type="dxa" w:w="50"/>
+              <w:left w:type="dxa" w:w="90"/>
+              <w:bottom w:type="dxa" w:w="50"/>
+              <w:right w:type="dxa" w:w="90"/>
+            </w:tcMar>
+          </w:tcPr>
+          <w:p>
+            <w:r>
+              <w:rPr>
+                <w:b w:val="false"/>
+                <w:bCs w:val="false"/>
+                <w:color w:val="000000"/>
+                <w:sz w:val="18"/>
+                <w:szCs w:val="18"/>
+              </w:rPr>
+              <w:t xml:space="preserve">Indispensable</w:t>
+            </w:r>
+          </w:p>
+        </w:tc>
+      </w:tr>
+      <w:tr>
+        <w:trPr>
+          <w:tblHeader w:val="false"/>
+        </w:trPr>
+        <w:tc>
+          <w:tcPr>
+            <w:tcW w:type="dxa" w:w="2208"/>
+            <w:tcMar>
+              <w:top w:type="dxa" w:w="50"/>
+              <w:left w:type="dxa" w:w="90"/>
+              <w:bottom w:type="dxa" w:w="50"/>
+              <w:right w:type="dxa" w:w="90"/>
+            </w:tcMar>
+          </w:tcPr>
+          <w:p>
+            <w:r>
+              <w:rPr>
+                <w:b w:val="false"/>
+                <w:bCs w:val="false"/>
+                <w:color w:val="000000"/>
+                <w:sz w:val="18"/>
+                <w:szCs w:val="18"/>
+              </w:rPr>
+              <w:t xml:space="preserve">3. Test InSAR décisif</w:t>
+            </w:r>
+          </w:p>
+        </w:tc>
+        <w:tc>
+          <w:tcPr>
+            <w:tcW w:type="dxa" w:w="5520"/>
+            <w:tcMar>
+              <w:top w:type="dxa" w:w="50"/>
+              <w:left w:type="dxa" w:w="90"/>
+              <w:bottom w:type="dxa" w:w="50"/>
+              <w:right w:type="dxa" w:w="90"/>
+            </w:tcMar>
+          </w:tcPr>
+          <w:p>
+            <w:r>
+              <w:rPr>
+                <w:b w:val="false"/>
+                <w:bCs w:val="false"/>
+                <w:color w:val="000000"/>
+                <w:sz w:val="18"/>
+                <w:szCs w:val="18"/>
+              </w:rPr>
+              <w:t xml:space="preserve">Réseau long+court baseline + GACOS ; courbes de cohérence ; corrélation InSAR vs laser ; fermeture de phase</w:t>
+            </w:r>
+          </w:p>
+        </w:tc>
+        <w:tc>
+          <w:tcPr>
+            <w:tcW w:type="dxa" w:w="1472"/>
+            <w:tcMar>
+              <w:top w:type="dxa" w:w="50"/>
+              <w:left w:type="dxa" w:w="90"/>
+              <w:bottom w:type="dxa" w:w="50"/>
+              <w:right w:type="dxa" w:w="90"/>
+            </w:tcMar>
+          </w:tcPr>
+          <w:p>
+            <w:r>
+              <w:rPr>
+                <w:b w:val="false"/>
+                <w:bCs w:val="false"/>
+                <w:color w:val="000000"/>
+                <w:sz w:val="18"/>
+                <w:szCs w:val="18"/>
+              </w:rPr>
+              <w:t xml:space="preserve">Cœur cadre B</w:t>
+            </w:r>
+          </w:p>
+        </w:tc>
+      </w:tr>
+      <w:tr>
+        <w:trPr>
+          <w:tblHeader w:val="false"/>
+        </w:trPr>
+        <w:tc>
+          <w:tcPr>
+            <w:tcW w:type="dxa" w:w="2208"/>
+            <w:shd w:fill="F0F0F0" w:val="clear"/>
+            <w:tcMar>
+              <w:top w:type="dxa" w:w="50"/>
+              <w:left w:type="dxa" w:w="90"/>
+              <w:bottom w:type="dxa" w:w="50"/>
+              <w:right w:type="dxa" w:w="90"/>
+            </w:tcMar>
+          </w:tcPr>
+          <w:p>
+            <w:r>
+              <w:rPr>
+                <w:b w:val="false"/>
+                <w:bCs w:val="false"/>
+                <w:color w:val="000000"/>
+                <w:sz w:val="18"/>
+                <w:szCs w:val="18"/>
+              </w:rPr>
+              <w:t xml:space="preserve">4. Géodésie/validation</w:t>
+            </w:r>
+          </w:p>
+        </w:tc>
+        <w:tc>
+          <w:tcPr>
+            <w:tcW w:type="dxa" w:w="5520"/>
+            <w:shd w:fill="F0F0F0" w:val="clear"/>
+            <w:tcMar>
+              <w:top w:type="dxa" w:w="50"/>
+              <w:left w:type="dxa" w:w="90"/>
+              <w:bottom w:type="dxa" w:w="50"/>
+              <w:right w:type="dxa" w:w="90"/>
+            </w:tcMar>
+          </w:tcPr>
+          <w:p>
+            <w:r>
+              <w:rPr>
+                <w:b w:val="false"/>
+                <w:bCs w:val="false"/>
+                <w:color w:val="000000"/>
+                <w:sz w:val="18"/>
+                <w:szCs w:val="18"/>
+              </w:rPr>
+              <w:t xml:space="preserve">LiDAR vs SfM, budget d'erreur UAV, GCP/RTK, DoD dé-aliasé par nappe, validation spatiale par DoD</w:t>
+            </w:r>
+          </w:p>
+        </w:tc>
+        <w:tc>
+          <w:tcPr>
+            <w:tcW w:type="dxa" w:w="1472"/>
+            <w:shd w:fill="F0F0F0" w:val="clear"/>
+            <w:tcMar>
+              <w:top w:type="dxa" w:w="50"/>
+              <w:left w:type="dxa" w:w="90"/>
+              <w:bottom w:type="dxa" w:w="50"/>
+              <w:right w:type="dxa" w:w="90"/>
+            </w:tcMar>
+          </w:tcPr>
+          <w:p>
+            <w:r>
+              <w:rPr>
+                <w:b w:val="false"/>
+                <w:bCs w:val="false"/>
+                <w:color w:val="000000"/>
+                <w:sz w:val="18"/>
+                <w:szCs w:val="18"/>
+              </w:rPr>
+              <w:t xml:space="preserve">Indispensable produit</w:t>
+            </w:r>
+          </w:p>
+        </w:tc>
+      </w:tr>
+      <w:tr>
+        <w:trPr>
+          <w:tblHeader w:val="false"/>
+        </w:trPr>
+        <w:tc>
+          <w:tcPr>
+            <w:tcW w:type="dxa" w:w="2208"/>
+            <w:tcMar>
+              <w:top w:type="dxa" w:w="50"/>
+              <w:left w:type="dxa" w:w="90"/>
+              <w:bottom w:type="dxa" w:w="50"/>
+              <w:right w:type="dxa" w:w="90"/>
+            </w:tcMar>
+          </w:tcPr>
+          <w:p>
+            <w:r>
+              <w:rPr>
+                <w:b w:val="false"/>
+                <w:bCs w:val="false"/>
+                <w:color w:val="000000"/>
+                <w:sz w:val="18"/>
+                <w:szCs w:val="18"/>
+              </w:rPr>
+              <w:t xml:space="preserve">5. Statistiques</w:t>
+            </w:r>
+          </w:p>
+        </w:tc>
+        <w:tc>
+          <w:tcPr>
+            <w:tcW w:type="dxa" w:w="5520"/>
+            <w:tcMar>
+              <w:top w:type="dxa" w:w="50"/>
+              <w:left w:type="dxa" w:w="90"/>
+              <w:bottom w:type="dxa" w:w="50"/>
+              <w:right w:type="dxa" w:w="90"/>
+            </w:tcMar>
+          </w:tcPr>
+          <w:p>
+            <w:r>
+              <w:rPr>
+                <w:b w:val="false"/>
+                <w:bCs w:val="false"/>
+                <w:color w:val="000000"/>
+                <w:sz w:val="18"/>
+                <w:szCs w:val="18"/>
+              </w:rPr>
+              <w:t xml:space="preserve">Erreur-type de la médiane + n_eff ; tests formels + IC ; validation croisée deramp ; biais top-k</w:t>
+            </w:r>
+          </w:p>
+        </w:tc>
+        <w:tc>
+          <w:tcPr>
+            <w:tcW w:type="dxa" w:w="1472"/>
+            <w:tcMar>
+              <w:top w:type="dxa" w:w="50"/>
+              <w:left w:type="dxa" w:w="90"/>
+              <w:bottom w:type="dxa" w:w="50"/>
+              <w:right w:type="dxa" w:w="90"/>
+            </w:tcMar>
+          </w:tcPr>
+          <w:p>
+            <w:r>
+              <w:rPr>
+                <w:b w:val="false"/>
+                <w:bCs w:val="false"/>
+                <w:color w:val="000000"/>
+                <w:sz w:val="18"/>
+                <w:szCs w:val="18"/>
+              </w:rPr>
+              <w:t xml:space="preserve">Indispensable</w:t>
+            </w:r>
+          </w:p>
+        </w:tc>
+      </w:tr>
+      <w:tr>
+        <w:trPr>
+          <w:tblHeader w:val="false"/>
+        </w:trPr>
+        <w:tc>
+          <w:tcPr>
+            <w:tcW w:type="dxa" w:w="2208"/>
+            <w:shd w:fill="F0F0F0" w:val="clear"/>
+            <w:tcMar>
+              <w:top w:type="dxa" w:w="50"/>
+              <w:left w:type="dxa" w:w="90"/>
+              <w:bottom w:type="dxa" w:w="50"/>
+              <w:right w:type="dxa" w:w="90"/>
+            </w:tcMar>
+          </w:tcPr>
+          <w:p>
+            <w:r>
+              <w:rPr>
+                <w:b w:val="false"/>
+                <w:bCs w:val="false"/>
+                <w:color w:val="000000"/>
+                <w:sz w:val="18"/>
+                <w:szCs w:val="18"/>
+              </w:rPr>
+              <w:t xml:space="preserve">6. Cadrage/perspective</w:t>
+            </w:r>
+          </w:p>
+        </w:tc>
+        <w:tc>
+          <w:tcPr>
+            <w:tcW w:type="dxa" w:w="5520"/>
+            <w:shd w:fill="F0F0F0" w:val="clear"/>
+            <w:tcMar>
+              <w:top w:type="dxa" w:w="50"/>
+              <w:left w:type="dxa" w:w="90"/>
+              <w:bottom w:type="dxa" w:w="50"/>
+              <w:right w:type="dxa" w:w="90"/>
+            </w:tcMar>
+          </w:tcPr>
+          <w:p>
+            <w:r>
+              <w:rPr>
+                <w:b w:val="false"/>
+                <w:bCs w:val="false"/>
+                <w:color w:val="000000"/>
+                <w:sz w:val="18"/>
+                <w:szCs w:val="18"/>
+              </w:rPr>
+              <w:t xml:space="preserve">Focaliser 1 contribution ; tableau comparatif tourbières ; plan NISAR L-band ; données/code ouverts</w:t>
+            </w:r>
+          </w:p>
+        </w:tc>
+        <w:tc>
+          <w:tcPr>
+            <w:tcW w:type="dxa" w:w="1472"/>
+            <w:shd w:fill="F0F0F0" w:val="clear"/>
+            <w:tcMar>
+              <w:top w:type="dxa" w:w="50"/>
+              <w:left w:type="dxa" w:w="90"/>
+              <w:bottom w:type="dxa" w:w="50"/>
+              <w:right w:type="dxa" w:w="90"/>
+            </w:tcMar>
+          </w:tcPr>
+          <w:p>
+            <w:r>
+              <w:rPr>
+                <w:b w:val="false"/>
+                <w:bCs w:val="false"/>
+                <w:color w:val="000000"/>
+                <w:sz w:val="18"/>
+                <w:szCs w:val="18"/>
+              </w:rPr>
+              <w:t xml:space="preserve">Rédaction</w:t>
+            </w:r>
+          </w:p>
+        </w:tc>
+      </w:tr>
+    </w:tbl>
+    <w:p>
+      <w:pPr>
+        <w:pStyle w:val="Heading2"/>
+        <w:spacing w:after="150" w:before="300"/>
+      </w:pPr>
+      <w:r>
+        <w:t xml:space="preserve">17.2 Barre Nature Communications</w:t>
+      </w:r>
+    </w:p>
+    <w:p>
+      <w:pPr>
+        <w:spacing w:after="120"/>
+      </w:pPr>
+      <w:r>
+        <w:t xml:space="preserve">Un single-site y passe rarement. Il faudrait soit plusieurs sites couvrant le gradient hydromorphologique (bog → fen flottant → marais) pour établir une loi d'observabilité générale, soit une avancée conceptuelle forte (séparation quantitative respiration/subsidence validée et reliée au bilan carbone régional). Sinon, viser RSE / ISPRS J., déjà ambitieux et bien adaptés à la contribution.</w:t>
+      </w:r>
+    </w:p>
+    <w:p>
+      <w:pPr>
+        <w:pBdr>
+          <w:left w:val="single" w:color="1F3864" w:sz="18" w:space="10"/>
+        </w:pBdr>
+        <w:spacing w:after="200" w:before="120"/>
+      </w:pPr>
+      <w:r>
+        <w:rPr>
+          <w:b/>
+          <w:bCs/>
+        </w:rPr>
+        <w:t xml:space="preserve">Synthèse pour l'auteur : </w:t>
+      </w:r>
+      <w:r>
+        <w:t xml:space="preserve">cinq blocs transforment une non-détection non diagnostiquée en étude de référence — (1) corriger le site avec sa propre littérature, (2) utiliser les données in situ (WTD, GES), (3) conduire le test InSAR site-vs-méthode au lieu de conclure sur la physique, (4) chiffrer la géodésie UAV et l'incertitude, (5) durcir la statistique.</w:t>
+      </w:r>
+    </w:p>
+    <w:p>
+      <w:r>
+        <w:br w:type="page"/>
+      </w:r>
+    </w:p>
+    <w:p>
+      <w:pPr>
+        <w:pStyle w:val="Heading1"/>
+        <w:spacing w:after="200" w:before="400"/>
+      </w:pPr>
+      <w:r>
         <w:t xml:space="preserve">Annexes</w:t>
       </w:r>
     </w:p>
@@ -7611,7 +8719,7 @@
         <w:spacing w:after="60"/>
       </w:pPr>
       <w:r>
-        <w:t xml:space="preserve">notebooks/phase01–15 et phase01b–04b — chaîne complète reproductible ;</w:t>
+        <w:t xml:space="preserve">docs/revue_comite_scientifique.md — revue par comité (6 reviewers) et feuille de route détaillée vers publication ;</w:t>
       </w:r>
     </w:p>
     <w:p>
@@ -7624,16 +8732,7 @@
         <w:spacing w:after="60"/>
       </w:pPr>
       <w:r>
-        <w:t xml:space="preserve">Ce rapport — synthèse générale.</w:t>
-      </w:r>
-    </w:p>
-    <w:p>
-      <w:pPr>
-        <w:pStyle w:val="Heading2"/>
-        <w:spacing w:after="150" w:before="300"/>
-      </w:pPr>
-      <w:r>
-        <w:t xml:space="preserve">D. Références clés mobilisées</w:t>
+        <w:t xml:space="preserve">notebooks/phase01–15 et phase01b–04b — chaîne complète reproductible ;</w:t>
       </w:r>
     </w:p>
     <w:p>
@@ -7646,7 +8745,16 @@
         <w:spacing w:after="60"/>
       </w:pPr>
       <w:r>
-        <w:t xml:space="preserve">Hrysiewicz A. et al. (2024). Estimation and validation of InSAR-derived surface displacements at temperate raised peatlands. Remote Sensing of Environment 291 (C-band, r=0.8–0.9, RMSE ~7 mm/an, respiration 10–40 mm).</w:t>
+        <w:t xml:space="preserve">Ce rapport — synthèse générale.</w:t>
+      </w:r>
+    </w:p>
+    <w:p>
+      <w:pPr>
+        <w:pStyle w:val="Heading2"/>
+        <w:spacing w:after="150" w:before="300"/>
+      </w:pPr>
+      <w:r>
+        <w:t xml:space="preserve">D. Références clés mobilisées</w:t>
       </w:r>
     </w:p>
     <w:p>
@@ -7659,7 +8767,7 @@
         <w:spacing w:after="60"/>
       </w:pPr>
       <w:r>
-        <w:t xml:space="preserve">Hong S.-H., Wdowinski S. (2014). Double-bounce component in cross-polarimetric SAR. IEEE TGRS (mécanisme double-bounce en zone humide).</w:t>
+        <w:t xml:space="preserve">Hrysiewicz A. et al. (2024). Estimation and validation of InSAR-derived surface displacements at temperate raised peatlands. Remote Sensing of Environment 291 (C-band, r=0.8–0.9, RMSE ~7 mm/an, respiration 10–40 mm).</w:t>
       </w:r>
     </w:p>
     <w:p>
@@ -7672,7 +8780,7 @@
         <w:spacing w:after="60"/>
       </w:pPr>
       <w:r>
-        <w:t xml:space="preserve">Wdowinski S., Hong S.-H. Wetland InSAR: a review of the technique and applications (phase = niveau d'eau sur végétation inondée).</w:t>
+        <w:t xml:space="preserve">Hong S.-H., Wdowinski S. (2014). Double-bounce component in cross-polarimetric SAR. IEEE TGRS (mécanisme double-bounce en zone humide).</w:t>
       </w:r>
     </w:p>
     <w:p>
@@ -7685,7 +8793,7 @@
         <w:spacing w:after="60"/>
       </w:pPr>
       <w:r>
-        <w:t xml:space="preserve">Ghezelayagh P. et al. (2024). Ecological Indicators 166:112305 (Biebrza, seasonal-annual, −1.44 cm/an — fen drainé, référence initiale).</w:t>
+        <w:t xml:space="preserve">Wdowinski S., Hong S.-H. Wetland InSAR: a review of the technique and applications (phase = niveau d'eau sur végétation inondée).</w:t>
       </w:r>
     </w:p>
     <w:p>
@@ -7698,7 +8806,7 @@
         <w:spacing w:after="60"/>
       </w:pPr>
       <w:r>
-        <w:t xml:space="preserve">« Modelling water table depth at rewetted peatlands with Sentinel-1 and Sentinel-2 » (2025) — appui direct à la reformulation covariable.</w:t>
+        <w:t xml:space="preserve">Ghezelayagh P. et al. (2024). Ecological Indicators 166:112305 (Biebrza, seasonal-annual, −1.44 cm/an — fen drainé, référence initiale).</w:t>
       </w:r>
     </w:p>
     <w:p>
@@ -7711,7 +8819,7 @@
         <w:spacing w:after="60"/>
       </w:pPr>
       <w:r>
-        <w:t xml:space="preserve">« Sentinel-1 interferometric coherence as a vegetation index » (2022), Remote Sensing of Environment.</w:t>
+        <w:t xml:space="preserve">« Modelling water table depth at rewetted peatlands with Sentinel-1 and Sentinel-2 » (2025) — appui direct à la reformulation covariable.</w:t>
       </w:r>
     </w:p>
     <w:p>
@@ -7724,7 +8832,7 @@
         <w:spacing w:after="60"/>
       </w:pPr>
       <w:r>
-        <w:t xml:space="preserve">Étude PlanetScope sur Rzecin (2017–2023), MDPI Remote Sensing 18(4):593, 2026 (EVI/phénologie vs nappe).</w:t>
+        <w:t xml:space="preserve">« Sentinel-1 interferometric coherence as a vegetation index » (2022), Remote Sensing of Environment.</w:t>
       </w:r>
     </w:p>
     <w:p>
@@ -7737,7 +8845,46 @@
         <w:spacing w:after="60"/>
       </w:pPr>
       <w:r>
+        <w:t xml:space="preserve">Étude PlanetScope sur Rzecin (2017–2023), MDPI Remote Sensing 18(4):593, 2026 (EVI/phénologie vs nappe).</w:t>
+      </w:r>
+    </w:p>
+    <w:p>
+      <w:pPr>
+        <w:pStyle w:val="ListParagraph"/>
+        <w:numPr>
+          <w:ilvl w:val="0"/>
+          <w:numId w:val="1"/>
+        </w:numPr>
+        <w:spacing w:after="60"/>
+      </w:pPr>
+      <w:r>
         <w:t xml:space="preserve">Revue « Remote sensing of peatland degradation in temperate and boreal zones » (2024), Ecological Indicators.</w:t>
+      </w:r>
+    </w:p>
+    <w:p>
+      <w:pPr>
+        <w:pStyle w:val="ListParagraph"/>
+        <w:numPr>
+          <w:ilvl w:val="0"/>
+          <w:numId w:val="1"/>
+        </w:numPr>
+        <w:spacing w:after="60"/>
+      </w:pPr>
+      <w:r>
+        <w:t xml:space="preserve">Juszczak R. et al. (2013) et travaux du groupe Rzecin/PEATBOG (Lamentowicz, Chojnicki) — hydrologie du tapis Sphagnum flottant, nappe 0–30 cm sous la surface, flux de GES, eddy-covariance (références à consolider).</w:t>
+      </w:r>
+    </w:p>
+    <w:p>
+      <w:pPr>
+        <w:pStyle w:val="ListParagraph"/>
+        <w:numPr>
+          <w:ilvl w:val="0"/>
+          <w:numId w:val="1"/>
+        </w:numPr>
+        <w:spacing w:after="60"/>
+      </w:pPr>
+      <w:r>
+        <w:t xml:space="preserve">« Exceptional hydrological stability of a Sphagnum-dominated peatland over the late Holocene » — stabilité hydrologique du site, résistance aux phases sèches.</w:t>
       </w:r>
     </w:p>
     <w:sectPr>

</xml_diff>